<commit_message>
Update the site to the final policy template
Replaced the downloadable .docx with the final version and carried its changes
through the site: personal and wearable devices in scope (landscape, filtering
and monitoring, pupil use exams rule); "age-appropriate teaching about AI"
wording throughout; new safeguarding content on nudification tools (Crime and
Policing Act 2026), voice cloning and fraud verification, and published pupil
images; recording and transcription rules on the data protection page; the
Online Safety Act chatbot amendments as a review trigger; a "wider legal
framework" section on the References page from the template's new appendix; and
the appendix noted on the template download page.

Co-Authored-By: Claude Fable 5 <noreply@anthropic.com>
Claude-Session: https://claude.ai/code/session_012ZT9VpQk5Q6wqcz3Toexui
</commit_message>
<xml_diff>
--- a/downloads/Use-of-AI-Policy-Template.docx
+++ b/downloads/Use-of-AI-Policy-Template.docx
@@ -425,7 +425,7 @@
                 <w:sz w:val="19"/>
                 <w:szCs w:val="19"/>
               </w:rPr>
-              <w:t xml:space="preserve">What counts as AI here, any excluded platform features, and whether pupil use is in scope.</w:t>
+              <w:t xml:space="preserve">What counts as AI here, including on personal and wearable devices; any excluded platform features; and whether pupil use is in scope.</w:t>
             </w:r>
           </w:p>
         </w:tc>
@@ -1118,7 +1118,84 @@
                 <w:sz w:val="19"/>
                 <w:szCs w:val="19"/>
               </w:rPr>
-              <w:t xml:space="preserve">Switch on only after a DPIA and an age-appropriate AI education plan are in place.</w:t>
+              <w:t xml:space="preserve">Switch on only after a DPIA is complete and age-appropriate teaching about AI is in place.</w:t>
+            </w:r>
+          </w:p>
+        </w:tc>
+      </w:tr>
+      <w:tr>
+        <w:tc>
+          <w:tcPr>
+            <w:tcW w:type="dxa" w:w="1000"/>
+            <w:tcMar>
+              <w:top w:type="dxa" w:w="85"/>
+              <w:left w:type="dxa" w:w="125"/>
+              <w:bottom w:type="dxa" w:w="85"/>
+              <w:right w:type="dxa" w:w="125"/>
+            </w:tcMar>
+          </w:tcPr>
+          <w:p>
+            <w:pPr>
+              <w:spacing w:after="0" w:line="250"/>
+            </w:pPr>
+            <w:r>
+              <w:rPr>
+                <w:rFonts w:ascii="Poppins" w:cs="Poppins" w:eastAsia="Poppins" w:hAnsi="Poppins"/>
+                <w:color w:val="1A1A1A"/>
+                <w:sz w:val="19"/>
+                <w:szCs w:val="19"/>
+              </w:rPr>
+              <w:t xml:space="preserve">A</w:t>
+            </w:r>
+          </w:p>
+        </w:tc>
+        <w:tc>
+          <w:tcPr>
+            <w:tcW w:type="dxa" w:w="3400"/>
+            <w:tcMar>
+              <w:top w:type="dxa" w:w="85"/>
+              <w:left w:type="dxa" w:w="125"/>
+              <w:bottom w:type="dxa" w:w="85"/>
+              <w:right w:type="dxa" w:w="125"/>
+            </w:tcMar>
+          </w:tcPr>
+          <w:p>
+            <w:pPr>
+              <w:spacing w:after="0" w:line="250"/>
+            </w:pPr>
+            <w:r>
+              <w:rPr>
+                <w:rFonts w:ascii="Poppins" w:cs="Poppins" w:eastAsia="Poppins" w:hAnsi="Poppins"/>
+                <w:color w:val="1A1A1A"/>
+                <w:sz w:val="19"/>
+                <w:szCs w:val="19"/>
+              </w:rPr>
+              <w:t xml:space="preserve">Appendix: legislation and guidance</w:t>
+            </w:r>
+          </w:p>
+        </w:tc>
+        <w:tc>
+          <w:tcPr>
+            <w:tcW w:type="dxa" w:w="5120"/>
+            <w:tcMar>
+              <w:top w:type="dxa" w:w="85"/>
+              <w:left w:type="dxa" w:w="125"/>
+              <w:bottom w:type="dxa" w:w="85"/>
+              <w:right w:type="dxa" w:w="125"/>
+            </w:tcMar>
+          </w:tcPr>
+          <w:p>
+            <w:pPr>
+              <w:spacing w:after="0" w:line="250"/>
+            </w:pPr>
+            <w:r>
+              <w:rPr>
+                <w:rFonts w:ascii="Poppins" w:cs="Poppins" w:eastAsia="Poppins" w:hAnsi="Poppins"/>
+                <w:color w:val="1A1A1A"/>
+                <w:sz w:val="19"/>
+                <w:szCs w:val="19"/>
+              </w:rPr>
+              <w:t xml:space="preserve">Check each instrument is current and in force at adoption; remove any that do not apply to your setting.</w:t>
             </w:r>
           </w:p>
         </w:tc>
@@ -2236,6 +2313,20 @@
           <w:sz w:val="21"/>
           <w:szCs w:val="21"/>
         </w:rPr>
+        <w:t xml:space="preserve">This list is the working framework. The appendix sets out the full range of legislation and guidance this policy rests on, including the criminal law behind section 9, with where each bears on the policy.</w:t>
+      </w:r>
+    </w:p>
+    <w:p>
+      <w:pPr>
+        <w:spacing w:after="150" w:line="272"/>
+      </w:pPr>
+      <w:r>
+        <w:rPr>
+          <w:rFonts w:ascii="Poppins" w:cs="Poppins" w:eastAsia="Poppins" w:hAnsi="Poppins"/>
+          <w:color w:val="1A1A1A"/>
+          <w:sz w:val="21"/>
+          <w:szCs w:val="21"/>
+        </w:rPr>
         <w:t xml:space="preserve">This policy governs use of AI by </w:t>
       </w:r>
       <w:r>
@@ -2341,6 +2432,20 @@
                 <w:sz w:val="19"/>
                 <w:szCs w:val="19"/>
               </w:rPr>
+              <w:t xml:space="preserve">Guidance moves quickly. At the time of writing, amendments to bring AI chatbots within the Online Safety Act are expected; treat their passage, or any change to KCSIE or DfE AI guidance, as a trigger for review ahead of your normal cycle.</w:t>
+            </w:r>
+          </w:p>
+          <w:p>
+            <w:pPr>
+              <w:spacing w:after="40" w:line="260"/>
+            </w:pPr>
+            <w:r>
+              <w:rPr>
+                <w:rFonts w:ascii="Poppins" w:cs="Poppins" w:eastAsia="Poppins" w:hAnsi="Poppins"/>
+                <w:color w:val="1A1A1A"/>
+                <w:sz w:val="19"/>
+                <w:szCs w:val="19"/>
+              </w:rPr>
               <w:t xml:space="preserve">Pupil use is out of scope unless the optional module is switched on and its preconditions are met.</w:t>
             </w:r>
           </w:p>
@@ -2377,6 +2482,51 @@
           <w:szCs w:val="21"/>
         </w:rPr>
         <w:t xml:space="preserve">In this policy, AI means generative AI tools and any software feature that creates content, or that makes or informs decisions or predictions about people, whether standalone, built into approved software, or reached through a browser. In practice that means chatbots, image and content generators, and AI features inside everyday software. Long-established automation such as spellcheck or predictive text is out of scope unless it does either of those things.</w:t>
+      </w:r>
+    </w:p>
+    <w:p>
+      <w:pPr>
+        <w:spacing w:after="150" w:line="272"/>
+      </w:pPr>
+      <w:r>
+        <w:rPr>
+          <w:rFonts w:ascii="Poppins" w:cs="Poppins" w:eastAsia="Poppins" w:hAnsi="Poppins"/>
+          <w:b/>
+          <w:bCs/>
+          <w:color w:val="1A1A1A"/>
+          <w:sz w:val="21"/>
+          <w:szCs w:val="21"/>
+        </w:rPr>
+        <w:t xml:space="preserve">AI on a personal or wearable device is still in scope. </w:t>
+      </w:r>
+      <w:r>
+        <w:rPr>
+          <w:rFonts w:ascii="Poppins" w:cs="Poppins" w:eastAsia="Poppins" w:hAnsi="Poppins"/>
+          <w:color w:val="1A1A1A"/>
+          <w:sz w:val="21"/>
+          <w:szCs w:val="21"/>
+        </w:rPr>
+        <w:t xml:space="preserve">AI reached through a personal device, including wearables such as smart glasses and other recording-capable devices, is covered by this policy whenever it is used in connection with the work of the organisation. Whether such devices may be brought onto the site at all, and the rules on recording, sit in </w:t>
+      </w:r>
+      <w:r>
+        <w:rPr>
+          <w:rFonts w:ascii="Poppins" w:cs="Poppins" w:eastAsia="Poppins" w:hAnsi="Poppins"/>
+          <w:b/>
+          <w:bCs/>
+          <w:color w:val="A04000"/>
+          <w:sz w:val="21"/>
+          <w:szCs w:val="21"/>
+        </w:rPr>
+        <w:t xml:space="preserve">[INSERT YOUR ACCEPTABLE USE AND MOBILE DEVICE POLICIES]</w:t>
+      </w:r>
+      <w:r>
+        <w:rPr>
+          <w:rFonts w:ascii="Poppins" w:cs="Poppins" w:eastAsia="Poppins" w:hAnsi="Poppins"/>
+          <w:color w:val="1A1A1A"/>
+          <w:sz w:val="21"/>
+          <w:szCs w:val="21"/>
+        </w:rPr>
+        <w:t xml:space="preserve">; capturing images, audio or video of others without their knowledge engages data protection law and, where children are involved, safeguarding (section 9).</w:t>
       </w:r>
     </w:p>
     <w:p>
@@ -2492,7 +2642,7 @@
                 <w:sz w:val="19"/>
                 <w:szCs w:val="19"/>
               </w:rPr>
-              <w:t xml:space="preserve">If pupils are to use AI, complete the pupil-use module at the end and amend the paragraph above. Do not bring pupils into scope until a DPIA and an age-appropriate AI education plan are both in place.</w:t>
+              <w:t xml:space="preserve">If pupils are to use AI, complete the pupil-use module at the end and amend the paragraph above. Do not bring pupils into scope until a DPIA is complete and age-appropriate teaching about AI is embedded in your curriculum.</w:t>
             </w:r>
           </w:p>
         </w:tc>
@@ -5261,16 +5411,16 @@
           <w:sz w:val="21"/>
           <w:szCs w:val="21"/>
         </w:rPr>
-        <w:t xml:space="preserve">Records, FOI and subject access. </w:t>
-      </w:r>
-      <w:r>
-        <w:rPr>
-          <w:rFonts w:ascii="Poppins" w:cs="Poppins" w:eastAsia="Poppins" w:hAnsi="Poppins"/>
-          <w:color w:val="1A1A1A"/>
-          <w:sz w:val="21"/>
-          <w:szCs w:val="21"/>
-        </w:rPr>
-        <w:t xml:space="preserve">Anything put into or produced by an AI tool is an organisational record: kept and disposed of under </w:t>
+        <w:t xml:space="preserve">Recording and transcription. </w:t>
+      </w:r>
+      <w:r>
+        <w:rPr>
+          <w:rFonts w:ascii="Poppins" w:cs="Poppins" w:eastAsia="Poppins" w:hAnsi="Poppins"/>
+          <w:color w:val="1A1A1A"/>
+          <w:sz w:val="21"/>
+          <w:szCs w:val="21"/>
+        </w:rPr>
+        <w:t xml:space="preserve">AI note-takers and meeting transcription features capture people’s words and voices: personal data gathered at source and, in pastoral, SEND or safeguarding discussions, often special category data. They are used only where approved for that purpose through section 4.2, and never in </w:t>
       </w:r>
       <w:r>
         <w:rPr>
@@ -5281,27 +5431,16 @@
           <w:sz w:val="21"/>
           <w:szCs w:val="21"/>
         </w:rPr>
-        <w:t xml:space="preserve">[INSERT YOUR RETENTION POLICY]</w:t>
-      </w:r>
-      <w:r>
-        <w:rPr>
-          <w:rFonts w:ascii="Poppins" w:cs="Poppins" w:eastAsia="Poppins" w:hAnsi="Poppins"/>
-          <w:color w:val="1A1A1A"/>
-          <w:sz w:val="21"/>
-          <w:szCs w:val="21"/>
-        </w:rPr>
-        <w:t xml:space="preserve">, potentially disclosable under freedom of information law, and within scope of subject access requests. When answering a request, check AI interaction logs as well as email and your management information system. </w:t>
-      </w:r>
-      <w:r>
-        <w:rPr>
-          <w:rFonts w:ascii="Poppins" w:cs="Poppins" w:eastAsia="Poppins" w:hAnsi="Poppins"/>
-          <w:b/>
-          <w:bCs/>
-          <w:color w:val="A04000"/>
-          <w:sz w:val="21"/>
-          <w:szCs w:val="21"/>
-        </w:rPr>
-        <w:t xml:space="preserve">[DELETE AS APPLICABLE: In a Microsoft school, staff prompts and responses in Copilot, including the free Copilot Chat, are searchable through Microsoft Purview under the standard audit licence, though standard retention is short. In a Google school, Gemini app conversations are searchable and exportable through Google Vault; Gemini features built into Gmail and Docs keep no record.]</w:t>
+        <w:t xml:space="preserve">[INSERT ANY MEETINGS WHERE AI RECORDING IS NOT PERMITTED, e.g. safeguarding case discussions]</w:t>
+      </w:r>
+      <w:r>
+        <w:rPr>
+          <w:rFonts w:ascii="Poppins" w:cs="Poppins" w:eastAsia="Poppins" w:hAnsi="Poppins"/>
+          <w:color w:val="1A1A1A"/>
+          <w:sz w:val="21"/>
+          <w:szCs w:val="21"/>
+        </w:rPr>
+        <w:t xml:space="preserve">. Everyone present is told before recording begins, an alternative is offered to anyone who objects, and unapproved note-taking assistants are not admitted to organisational meetings. Transcripts are checked for accuracy by someone who was present, then held as organisational records under the retention arrangements below rather than left on the provider’s platform.</w:t>
       </w:r>
     </w:p>
     <w:p>
@@ -5322,130 +5461,16 @@
           <w:sz w:val="21"/>
           <w:szCs w:val="21"/>
         </w:rPr>
-        <w:t xml:space="preserve">Security. </w:t>
-      </w:r>
-      <w:r>
-        <w:rPr>
-          <w:rFonts w:ascii="Poppins" w:cs="Poppins" w:eastAsia="Poppins" w:hAnsi="Poppins"/>
-          <w:color w:val="1A1A1A"/>
-          <w:sz w:val="21"/>
-          <w:szCs w:val="21"/>
-        </w:rPr>
-        <w:t xml:space="preserve">Tools and accounts fall under standard cyber controls, including multi-factor authentication, patching and managed access, consistent with the DfE cyber security standards.</w:t>
-      </w:r>
-    </w:p>
-    <w:p>
-      <w:pPr>
-        <w:pStyle w:val="Heading2"/>
-        <w:keepNext/>
-        <w:spacing w:after="130" w:before="260"/>
-      </w:pPr>
-      <w:r>
-        <w:rPr>
-          <w:rFonts w:ascii="Exo 2" w:cs="Exo 2" w:eastAsia="Exo 2" w:hAnsi="Exo 2"/>
-          <w:b/>
-          <w:bCs/>
-          <w:color w:val="2C3E50"/>
-          <w:sz w:val="27"/>
-          <w:szCs w:val="27"/>
-        </w:rPr>
-        <w:t xml:space="preserve">8. Accuracy, bias, accountability and human oversight</w:t>
-      </w:r>
-    </w:p>
-    <w:p>
-      <w:pPr>
-        <w:pStyle w:val="Heading3"/>
-        <w:keepNext/>
-        <w:spacing w:after="100" w:before="190"/>
-      </w:pPr>
-      <w:r>
-        <w:rPr>
-          <w:rFonts w:ascii="Exo 2" w:cs="Exo 2" w:eastAsia="Exo 2" w:hAnsi="Exo 2"/>
-          <w:b/>
-          <w:bCs/>
-          <w:color w:val="34495E"/>
-          <w:sz w:val="23"/>
-          <w:szCs w:val="23"/>
-        </w:rPr>
-        <w:t xml:space="preserve">8.1 Getting things wrong</w:t>
-      </w:r>
-    </w:p>
-    <w:p>
-      <w:pPr>
-        <w:spacing w:after="150" w:line="272"/>
-      </w:pPr>
-      <w:r>
-        <w:rPr>
-          <w:rFonts w:ascii="Poppins" w:cs="Poppins" w:eastAsia="Poppins" w:hAnsi="Poppins"/>
-          <w:color w:val="1A1A1A"/>
-          <w:sz w:val="21"/>
-          <w:szCs w:val="21"/>
-        </w:rPr>
-        <w:t xml:space="preserve">AI can state untruths, invent sources, carry the biases of its training data, or be out of date. Anything factual is checked against a reliable source before use, and outputs are read critically for bias, especially where they touch teaching, assessment, messages to parents or anything going to an external body.</w:t>
-      </w:r>
-    </w:p>
-    <w:p>
-      <w:pPr>
-        <w:pStyle w:val="Heading3"/>
-        <w:keepNext/>
-        <w:spacing w:after="100" w:before="190"/>
-      </w:pPr>
-      <w:r>
-        <w:rPr>
-          <w:rFonts w:ascii="Exo 2" w:cs="Exo 2" w:eastAsia="Exo 2" w:hAnsi="Exo 2"/>
-          <w:b/>
-          <w:bCs/>
-          <w:color w:val="34495E"/>
-          <w:sz w:val="23"/>
-          <w:szCs w:val="23"/>
-        </w:rPr>
-        <w:t xml:space="preserve">8.2 How prompts shape, and skew, responses</w:t>
-      </w:r>
-    </w:p>
-    <w:p>
-      <w:pPr>
-        <w:spacing w:after="150" w:line="272"/>
-      </w:pPr>
-      <w:r>
-        <w:rPr>
-          <w:rFonts w:ascii="Poppins" w:cs="Poppins" w:eastAsia="Poppins" w:hAnsi="Poppins"/>
-          <w:color w:val="1A1A1A"/>
-          <w:sz w:val="21"/>
-          <w:szCs w:val="21"/>
-        </w:rPr>
-        <w:t xml:space="preserve">Generative AI reflects the patterns in its training data, and the same request often comes back differently depending on the words used. Ask a tool to explain something “to a boy” and then “to a girl”, and the responses can differ in tone, assumption and content: training biases surfacing. Setting an audience in a prompt is often sound teaching practice, but staff should know it can pull stereotyped or culturally skewed material into the output, and read what comes back with that in mind.</w:t>
-      </w:r>
-    </w:p>
-    <w:p>
-      <w:pPr>
-        <w:pStyle w:val="Heading3"/>
-        <w:keepNext/>
-        <w:spacing w:after="100" w:before="190"/>
-      </w:pPr>
-      <w:r>
-        <w:rPr>
-          <w:rFonts w:ascii="Exo 2" w:cs="Exo 2" w:eastAsia="Exo 2" w:hAnsi="Exo 2"/>
-          <w:b/>
-          <w:bCs/>
-          <w:color w:val="34495E"/>
-          <w:sz w:val="23"/>
-          <w:szCs w:val="23"/>
-        </w:rPr>
-        <w:t xml:space="preserve">8.3 Unsuitable or concerning output</w:t>
-      </w:r>
-    </w:p>
-    <w:p>
-      <w:pPr>
-        <w:spacing w:after="150" w:line="272"/>
-      </w:pPr>
-      <w:r>
-        <w:rPr>
-          <w:rFonts w:ascii="Poppins" w:cs="Poppins" w:eastAsia="Poppins" w:hAnsi="Poppins"/>
-          <w:color w:val="1A1A1A"/>
-          <w:sz w:val="21"/>
-          <w:szCs w:val="21"/>
-        </w:rPr>
-        <w:t xml:space="preserve">Outputs are read in full before use. Anything raising a safeguarding concern goes to the </w:t>
+        <w:t xml:space="preserve">Records, FOI and subject access. </w:t>
+      </w:r>
+      <w:r>
+        <w:rPr>
+          <w:rFonts w:ascii="Poppins" w:cs="Poppins" w:eastAsia="Poppins" w:hAnsi="Poppins"/>
+          <w:color w:val="1A1A1A"/>
+          <w:sz w:val="21"/>
+          <w:szCs w:val="21"/>
+        </w:rPr>
+        <w:t xml:space="preserve">Anything put into or produced by an AI tool is an organisational record: kept and disposed of under </w:t>
       </w:r>
       <w:r>
         <w:rPr>
@@ -5456,48 +5481,16 @@
           <w:sz w:val="21"/>
           <w:szCs w:val="21"/>
         </w:rPr>
-        <w:t xml:space="preserve">[INSERT DESIGNATED SAFEGUARDING LEAD]</w:t>
-      </w:r>
-      <w:r>
-        <w:rPr>
-          <w:rFonts w:ascii="Poppins" w:cs="Poppins" w:eastAsia="Poppins" w:hAnsi="Poppins"/>
-          <w:color w:val="1A1A1A"/>
-          <w:sz w:val="21"/>
-          <w:szCs w:val="21"/>
-        </w:rPr>
-        <w:t xml:space="preserve"> at once, with the material retained for review.</w:t>
-      </w:r>
-    </w:p>
-    <w:p>
-      <w:pPr>
-        <w:pStyle w:val="Heading3"/>
-        <w:keepNext/>
-        <w:spacing w:after="100" w:before="190"/>
-      </w:pPr>
-      <w:r>
-        <w:rPr>
-          <w:rFonts w:ascii="Exo 2" w:cs="Exo 2" w:eastAsia="Exo 2" w:hAnsi="Exo 2"/>
-          <w:b/>
-          <w:bCs/>
-          <w:color w:val="34495E"/>
-          <w:sz w:val="23"/>
-          <w:szCs w:val="23"/>
-        </w:rPr>
-        <w:t xml:space="preserve">8.4 Being open about AI use</w:t>
-      </w:r>
-    </w:p>
-    <w:p>
-      <w:pPr>
-        <w:spacing w:after="150" w:line="272"/>
-      </w:pPr>
-      <w:r>
-        <w:rPr>
-          <w:rFonts w:ascii="Poppins" w:cs="Poppins" w:eastAsia="Poppins" w:hAnsi="Poppins"/>
-          <w:color w:val="1A1A1A"/>
-          <w:sz w:val="21"/>
-          <w:szCs w:val="21"/>
-        </w:rPr>
-        <w:t xml:space="preserve">Staff should be ready to say where they have used AI. Where a document drafted substantially with AI goes to </w:t>
+        <w:t xml:space="preserve">[INSERT YOUR RETENTION POLICY]</w:t>
+      </w:r>
+      <w:r>
+        <w:rPr>
+          <w:rFonts w:ascii="Poppins" w:cs="Poppins" w:eastAsia="Poppins" w:hAnsi="Poppins"/>
+          <w:color w:val="1A1A1A"/>
+          <w:sz w:val="21"/>
+          <w:szCs w:val="21"/>
+        </w:rPr>
+        <w:t xml:space="preserve">, potentially disclosable under freedom of information law, and within scope of subject access requests. When answering a request, check AI interaction logs as well as email and your management information system. </w:t>
       </w:r>
       <w:r>
         <w:rPr>
@@ -5508,59 +5501,7 @@
           <w:sz w:val="21"/>
           <w:szCs w:val="21"/>
         </w:rPr>
-        <w:t xml:space="preserve">[INSERT EXTERNAL BODIES, e.g. governors, the regulator or the DfE]</w:t>
-      </w:r>
-      <w:r>
-        <w:rPr>
-          <w:rFonts w:ascii="Poppins" w:cs="Poppins" w:eastAsia="Poppins" w:hAnsi="Poppins"/>
-          <w:color w:val="1A1A1A"/>
-          <w:sz w:val="21"/>
-          <w:szCs w:val="21"/>
-        </w:rPr>
-        <w:t xml:space="preserve">, that use is disclosed. Responsibility is unchanged: the author owns the content.</w:t>
-      </w:r>
-    </w:p>
-    <w:p>
-      <w:pPr>
-        <w:pStyle w:val="Heading3"/>
-        <w:keepNext/>
-        <w:spacing w:after="100" w:before="190"/>
-      </w:pPr>
-      <w:r>
-        <w:rPr>
-          <w:rFonts w:ascii="Exo 2" w:cs="Exo 2" w:eastAsia="Exo 2" w:hAnsi="Exo 2"/>
-          <w:b/>
-          <w:bCs/>
-          <w:color w:val="34495E"/>
-          <w:sz w:val="23"/>
-          <w:szCs w:val="23"/>
-        </w:rPr>
-        <w:t xml:space="preserve">8.5 Keeping a person in charge</w:t>
-      </w:r>
-    </w:p>
-    <w:p>
-      <w:pPr>
-        <w:spacing w:after="150" w:line="272"/>
-      </w:pPr>
-      <w:r>
-        <w:rPr>
-          <w:rFonts w:ascii="Poppins" w:cs="Poppins" w:eastAsia="Poppins" w:hAnsi="Poppins"/>
-          <w:b/>
-          <w:bCs/>
-          <w:color w:val="1A1A1A"/>
-          <w:sz w:val="21"/>
-          <w:szCs w:val="21"/>
-        </w:rPr>
-        <w:t xml:space="preserve">A person stays in charge. </w:t>
-      </w:r>
-      <w:r>
-        <w:rPr>
-          <w:rFonts w:ascii="Poppins" w:cs="Poppins" w:eastAsia="Poppins" w:hAnsi="Poppins"/>
-          <w:color w:val="1A1A1A"/>
-          <w:sz w:val="21"/>
-          <w:szCs w:val="21"/>
-        </w:rPr>
-        <w:t xml:space="preserve">However persuasive an output looks, it is not used, shared, published or acted on until a suitably qualified member of staff has reviewed it and applied their own judgement.</w:t>
+        <w:t xml:space="preserve">[DELETE AS APPLICABLE: In a Microsoft school, staff prompts and responses in Copilot, including the free Copilot Chat, are searchable through Microsoft Purview under the standard audit licence, though standard retention is short. In a Google school, Gemini app conversations are searchable and exportable through Google Vault; Gemini features built into Gmail and Docs keep no record.]</w:t>
       </w:r>
     </w:p>
     <w:p>
@@ -5581,7 +5522,245 @@
           <w:sz w:val="21"/>
           <w:szCs w:val="21"/>
         </w:rPr>
-        <w:t xml:space="preserve">Treat it as a draft, not an answer.</w:t>
+        <w:t xml:space="preserve">Security. </w:t>
+      </w:r>
+      <w:r>
+        <w:rPr>
+          <w:rFonts w:ascii="Poppins" w:cs="Poppins" w:eastAsia="Poppins" w:hAnsi="Poppins"/>
+          <w:color w:val="1A1A1A"/>
+          <w:sz w:val="21"/>
+          <w:szCs w:val="21"/>
+        </w:rPr>
+        <w:t xml:space="preserve">Tools and accounts fall under standard cyber controls, including multi-factor authentication, patching and managed access, consistent with the DfE cyber security standards.</w:t>
+      </w:r>
+    </w:p>
+    <w:p>
+      <w:pPr>
+        <w:pStyle w:val="Heading2"/>
+        <w:keepNext/>
+        <w:spacing w:after="130" w:before="260"/>
+      </w:pPr>
+      <w:r>
+        <w:rPr>
+          <w:rFonts w:ascii="Exo 2" w:cs="Exo 2" w:eastAsia="Exo 2" w:hAnsi="Exo 2"/>
+          <w:b/>
+          <w:bCs/>
+          <w:color w:val="2C3E50"/>
+          <w:sz w:val="27"/>
+          <w:szCs w:val="27"/>
+        </w:rPr>
+        <w:t xml:space="preserve">8. Accuracy, bias, accountability and human oversight</w:t>
+      </w:r>
+    </w:p>
+    <w:p>
+      <w:pPr>
+        <w:pStyle w:val="Heading3"/>
+        <w:keepNext/>
+        <w:spacing w:after="100" w:before="190"/>
+      </w:pPr>
+      <w:r>
+        <w:rPr>
+          <w:rFonts w:ascii="Exo 2" w:cs="Exo 2" w:eastAsia="Exo 2" w:hAnsi="Exo 2"/>
+          <w:b/>
+          <w:bCs/>
+          <w:color w:val="34495E"/>
+          <w:sz w:val="23"/>
+          <w:szCs w:val="23"/>
+        </w:rPr>
+        <w:t xml:space="preserve">8.1 Getting things wrong</w:t>
+      </w:r>
+    </w:p>
+    <w:p>
+      <w:pPr>
+        <w:spacing w:after="150" w:line="272"/>
+      </w:pPr>
+      <w:r>
+        <w:rPr>
+          <w:rFonts w:ascii="Poppins" w:cs="Poppins" w:eastAsia="Poppins" w:hAnsi="Poppins"/>
+          <w:color w:val="1A1A1A"/>
+          <w:sz w:val="21"/>
+          <w:szCs w:val="21"/>
+        </w:rPr>
+        <w:t xml:space="preserve">AI can state untruths, invent sources, carry the biases of its training data, or be out of date. Anything factual is checked against a reliable source before use, and outputs are read critically for bias, especially where they touch teaching, assessment, messages to parents or anything going to an external body.</w:t>
+      </w:r>
+    </w:p>
+    <w:p>
+      <w:pPr>
+        <w:pStyle w:val="Heading3"/>
+        <w:keepNext/>
+        <w:spacing w:after="100" w:before="190"/>
+      </w:pPr>
+      <w:r>
+        <w:rPr>
+          <w:rFonts w:ascii="Exo 2" w:cs="Exo 2" w:eastAsia="Exo 2" w:hAnsi="Exo 2"/>
+          <w:b/>
+          <w:bCs/>
+          <w:color w:val="34495E"/>
+          <w:sz w:val="23"/>
+          <w:szCs w:val="23"/>
+        </w:rPr>
+        <w:t xml:space="preserve">8.2 How prompts shape, and skew, responses</w:t>
+      </w:r>
+    </w:p>
+    <w:p>
+      <w:pPr>
+        <w:spacing w:after="150" w:line="272"/>
+      </w:pPr>
+      <w:r>
+        <w:rPr>
+          <w:rFonts w:ascii="Poppins" w:cs="Poppins" w:eastAsia="Poppins" w:hAnsi="Poppins"/>
+          <w:color w:val="1A1A1A"/>
+          <w:sz w:val="21"/>
+          <w:szCs w:val="21"/>
+        </w:rPr>
+        <w:t xml:space="preserve">Generative AI reflects the patterns in its training data, and the same request often comes back differently depending on the words used. Ask a tool to explain something “to a boy” and then “to a girl”, and the responses can differ in tone, assumption and content: training biases surfacing. Setting an audience in a prompt is often sound teaching practice, but staff should know it can pull stereotyped or culturally skewed material into the output, and read what comes back with that in mind.</w:t>
+      </w:r>
+    </w:p>
+    <w:p>
+      <w:pPr>
+        <w:pStyle w:val="Heading3"/>
+        <w:keepNext/>
+        <w:spacing w:after="100" w:before="190"/>
+      </w:pPr>
+      <w:r>
+        <w:rPr>
+          <w:rFonts w:ascii="Exo 2" w:cs="Exo 2" w:eastAsia="Exo 2" w:hAnsi="Exo 2"/>
+          <w:b/>
+          <w:bCs/>
+          <w:color w:val="34495E"/>
+          <w:sz w:val="23"/>
+          <w:szCs w:val="23"/>
+        </w:rPr>
+        <w:t xml:space="preserve">8.3 Unsuitable or concerning output</w:t>
+      </w:r>
+    </w:p>
+    <w:p>
+      <w:pPr>
+        <w:spacing w:after="150" w:line="272"/>
+      </w:pPr>
+      <w:r>
+        <w:rPr>
+          <w:rFonts w:ascii="Poppins" w:cs="Poppins" w:eastAsia="Poppins" w:hAnsi="Poppins"/>
+          <w:color w:val="1A1A1A"/>
+          <w:sz w:val="21"/>
+          <w:szCs w:val="21"/>
+        </w:rPr>
+        <w:t xml:space="preserve">Outputs are read in full before use. Anything raising a safeguarding concern goes to the </w:t>
+      </w:r>
+      <w:r>
+        <w:rPr>
+          <w:rFonts w:ascii="Poppins" w:cs="Poppins" w:eastAsia="Poppins" w:hAnsi="Poppins"/>
+          <w:b/>
+          <w:bCs/>
+          <w:color w:val="A04000"/>
+          <w:sz w:val="21"/>
+          <w:szCs w:val="21"/>
+        </w:rPr>
+        <w:t xml:space="preserve">[INSERT DESIGNATED SAFEGUARDING LEAD]</w:t>
+      </w:r>
+      <w:r>
+        <w:rPr>
+          <w:rFonts w:ascii="Poppins" w:cs="Poppins" w:eastAsia="Poppins" w:hAnsi="Poppins"/>
+          <w:color w:val="1A1A1A"/>
+          <w:sz w:val="21"/>
+          <w:szCs w:val="21"/>
+        </w:rPr>
+        <w:t xml:space="preserve"> at once, with the material retained for review.</w:t>
+      </w:r>
+    </w:p>
+    <w:p>
+      <w:pPr>
+        <w:pStyle w:val="Heading3"/>
+        <w:keepNext/>
+        <w:spacing w:after="100" w:before="190"/>
+      </w:pPr>
+      <w:r>
+        <w:rPr>
+          <w:rFonts w:ascii="Exo 2" w:cs="Exo 2" w:eastAsia="Exo 2" w:hAnsi="Exo 2"/>
+          <w:b/>
+          <w:bCs/>
+          <w:color w:val="34495E"/>
+          <w:sz w:val="23"/>
+          <w:szCs w:val="23"/>
+        </w:rPr>
+        <w:t xml:space="preserve">8.4 Being open about AI use</w:t>
+      </w:r>
+    </w:p>
+    <w:p>
+      <w:pPr>
+        <w:spacing w:after="150" w:line="272"/>
+      </w:pPr>
+      <w:r>
+        <w:rPr>
+          <w:rFonts w:ascii="Poppins" w:cs="Poppins" w:eastAsia="Poppins" w:hAnsi="Poppins"/>
+          <w:color w:val="1A1A1A"/>
+          <w:sz w:val="21"/>
+          <w:szCs w:val="21"/>
+        </w:rPr>
+        <w:t xml:space="preserve">Staff should be ready to say where they have used AI. Where a document drafted substantially with AI goes to </w:t>
+      </w:r>
+      <w:r>
+        <w:rPr>
+          <w:rFonts w:ascii="Poppins" w:cs="Poppins" w:eastAsia="Poppins" w:hAnsi="Poppins"/>
+          <w:b/>
+          <w:bCs/>
+          <w:color w:val="A04000"/>
+          <w:sz w:val="21"/>
+          <w:szCs w:val="21"/>
+        </w:rPr>
+        <w:t xml:space="preserve">[INSERT EXTERNAL BODIES, e.g. governors, the regulator or the DfE]</w:t>
+      </w:r>
+      <w:r>
+        <w:rPr>
+          <w:rFonts w:ascii="Poppins" w:cs="Poppins" w:eastAsia="Poppins" w:hAnsi="Poppins"/>
+          <w:color w:val="1A1A1A"/>
+          <w:sz w:val="21"/>
+          <w:szCs w:val="21"/>
+        </w:rPr>
+        <w:t xml:space="preserve">, that use is disclosed. Responsibility is unchanged: the author owns the content.</w:t>
+      </w:r>
+    </w:p>
+    <w:p>
+      <w:pPr>
+        <w:pStyle w:val="Heading3"/>
+        <w:keepNext/>
+        <w:spacing w:after="100" w:before="190"/>
+      </w:pPr>
+      <w:r>
+        <w:rPr>
+          <w:rFonts w:ascii="Exo 2" w:cs="Exo 2" w:eastAsia="Exo 2" w:hAnsi="Exo 2"/>
+          <w:b/>
+          <w:bCs/>
+          <w:color w:val="34495E"/>
+          <w:sz w:val="23"/>
+          <w:szCs w:val="23"/>
+        </w:rPr>
+        <w:t xml:space="preserve">8.5 Keeping a person in charge</w:t>
+      </w:r>
+    </w:p>
+    <w:p>
+      <w:pPr>
+        <w:spacing w:after="150" w:line="272"/>
+      </w:pPr>
+      <w:r>
+        <w:rPr>
+          <w:rFonts w:ascii="Poppins" w:cs="Poppins" w:eastAsia="Poppins" w:hAnsi="Poppins"/>
+          <w:b/>
+          <w:bCs/>
+          <w:color w:val="1A1A1A"/>
+          <w:sz w:val="21"/>
+          <w:szCs w:val="21"/>
+        </w:rPr>
+        <w:t xml:space="preserve">A person stays in charge. </w:t>
+      </w:r>
+      <w:r>
+        <w:rPr>
+          <w:rFonts w:ascii="Poppins" w:cs="Poppins" w:eastAsia="Poppins" w:hAnsi="Poppins"/>
+          <w:color w:val="1A1A1A"/>
+          <w:sz w:val="21"/>
+          <w:szCs w:val="21"/>
+        </w:rPr>
+        <w:t xml:space="preserve">However persuasive an output looks, it is not used, shared, published or acted on until a suitably qualified member of staff has reviewed it and applied their own judgement.</w:t>
       </w:r>
     </w:p>
     <w:p>
@@ -5602,16 +5781,7 @@
           <w:sz w:val="21"/>
           <w:szCs w:val="21"/>
         </w:rPr>
-        <w:t xml:space="preserve">The output is yours; </w:t>
-      </w:r>
-      <w:r>
-        <w:rPr>
-          <w:rFonts w:ascii="Poppins" w:cs="Poppins" w:eastAsia="Poppins" w:hAnsi="Poppins"/>
-          <w:color w:val="1A1A1A"/>
-          <w:sz w:val="21"/>
-          <w:szCs w:val="21"/>
-        </w:rPr>
-        <w:t xml:space="preserve">using AI is no excuse for getting it wrong.</w:t>
+        <w:t xml:space="preserve">Treat it as a draft, not an answer.</w:t>
       </w:r>
     </w:p>
     <w:p>
@@ -5632,7 +5802,16 @@
           <w:sz w:val="21"/>
           <w:szCs w:val="21"/>
         </w:rPr>
-        <w:t xml:space="preserve">Read it properly, in full, before you use it.</w:t>
+        <w:t xml:space="preserve">The output is yours; </w:t>
+      </w:r>
+      <w:r>
+        <w:rPr>
+          <w:rFonts w:ascii="Poppins" w:cs="Poppins" w:eastAsia="Poppins" w:hAnsi="Poppins"/>
+          <w:color w:val="1A1A1A"/>
+          <w:sz w:val="21"/>
+          <w:szCs w:val="21"/>
+        </w:rPr>
+        <w:t xml:space="preserve">using AI is no excuse for getting it wrong.</w:t>
       </w:r>
     </w:p>
     <w:p>
@@ -5653,6 +5832,27 @@
           <w:sz w:val="21"/>
           <w:szCs w:val="21"/>
         </w:rPr>
+        <w:t xml:space="preserve">Read it properly, in full, before you use it.</w:t>
+      </w:r>
+    </w:p>
+    <w:p>
+      <w:pPr>
+        <w:pStyle w:val="ListParagraph"/>
+        <w:numPr>
+          <w:ilvl w:val="0"/>
+          <w:numId w:val="2"/>
+        </w:numPr>
+        <w:spacing w:after="90" w:line="272"/>
+      </w:pPr>
+      <w:r>
+        <w:rPr>
+          <w:rFonts w:ascii="Poppins" w:cs="Poppins" w:eastAsia="Poppins" w:hAnsi="Poppins"/>
+          <w:b/>
+          <w:bCs/>
+          <w:color w:val="1A1A1A"/>
+          <w:sz w:val="21"/>
+          <w:szCs w:val="21"/>
+        </w:rPr>
         <w:t xml:space="preserve">People, not AI, decide about people.</w:t>
       </w:r>
     </w:p>
@@ -5740,6 +5940,54 @@
           <w:szCs w:val="21"/>
         </w:rPr>
         <w:t xml:space="preserve">, handled under the child protection policy and referred to the police where required, in line with the Online Safety Act 2023 and the Ofcom Protection of Children code. Multi-agency action follows Working Together to Safeguard Children 2026.</w:t>
+      </w:r>
+    </w:p>
+    <w:p>
+      <w:pPr>
+        <w:spacing w:after="150" w:line="272"/>
+      </w:pPr>
+      <w:r>
+        <w:rPr>
+          <w:rFonts w:ascii="Poppins" w:cs="Poppins" w:eastAsia="Poppins" w:hAnsi="Poppins"/>
+          <w:color w:val="1A1A1A"/>
+          <w:sz w:val="21"/>
+          <w:szCs w:val="21"/>
+        </w:rPr>
+        <w:t xml:space="preserve">Making, adapting, supplying or offering nudification tools, tools designed to remove clothing from images of real people, is a criminal offence under the Crime and Policing Act 2026. Any encounter with such a tool involving a member of this community is a safeguarding matter and is reported as above. Staff must not use AI to clone or simulate the voice or likeness of any pupil, parent or colleague; and because cloned voices and fabricated messages are increasingly used in fraud, any unusual or urgent request, particularly one involving payments, credentials or personal data, is verified through a known channel before anyone acts on it, in line with the DfE cyber security standards.</w:t>
+      </w:r>
+    </w:p>
+    <w:p>
+      <w:pPr>
+        <w:spacing w:after="150" w:line="272"/>
+      </w:pPr>
+      <w:r>
+        <w:rPr>
+          <w:rFonts w:ascii="Poppins" w:cs="Poppins" w:eastAsia="Poppins" w:hAnsi="Poppins"/>
+          <w:color w:val="1A1A1A"/>
+          <w:sz w:val="21"/>
+          <w:szCs w:val="21"/>
+        </w:rPr>
+        <w:t xml:space="preserve">Automated tools can harvest photographs of children from public webpages and social media, including the organisation’s own, for use in fabricated or abusive material. The organisation keeps its publication of identifiable pupil images, and the consent underpinning it, under review with this risk in mind, alongside </w:t>
+      </w:r>
+      <w:r>
+        <w:rPr>
+          <w:rFonts w:ascii="Poppins" w:cs="Poppins" w:eastAsia="Poppins" w:hAnsi="Poppins"/>
+          <w:b/>
+          <w:bCs/>
+          <w:color w:val="A04000"/>
+          <w:sz w:val="21"/>
+          <w:szCs w:val="21"/>
+        </w:rPr>
+        <w:t xml:space="preserve">[INSERT YOUR IMAGE CONSENT AND PUBLICATION ARRANGEMENTS, e.g. your data protection policy and website practice]</w:t>
+      </w:r>
+      <w:r>
+        <w:rPr>
+          <w:rFonts w:ascii="Poppins" w:cs="Poppins" w:eastAsia="Poppins" w:hAnsi="Poppins"/>
+          <w:color w:val="1A1A1A"/>
+          <w:sz w:val="21"/>
+          <w:szCs w:val="21"/>
+        </w:rPr>
+        <w:t xml:space="preserve">.</w:t>
       </w:r>
     </w:p>
     <w:p>
@@ -6023,7 +6271,7 @@
           <w:sz w:val="21"/>
           <w:szCs w:val="21"/>
         </w:rPr>
-        <w:t xml:space="preserve">Access to AI services sits within the organisation’s filtering and monitoring, in line with the DfE filtering and monitoring standards and current UK Safer Internet Centre definitions. Unapproved services are blocked at network level so far as reasonably possible. The named senior lead is the filtering and monitoring lead (section 3). Each year the review considers how generative AI tools are used, and whether the solution can handle real-time, dynamic, personalised and AI-generated content. No filter reliably catches live AI-generated content. That is why the approved list (section 4) and human oversight (section 8) matter as much as network controls. Detailed arrangements live in </w:t>
+        <w:t xml:space="preserve">Access to AI services sits within the organisation’s filtering and monitoring, in line with the DfE filtering and monitoring standards and current UK Safer Internet Centre definitions. Unapproved services are blocked at network level so far as reasonably possible. The named senior lead is the filtering and monitoring lead (section 3). Each year the review considers how generative AI tools are used, whether the solution can handle real-time, dynamic, personalised and AI-generated content, and how access routes that bypass network controls, including personal devices with their own connectivity such as wearables, are managed. No filter reliably catches live AI-generated content. That is why the approved list (section 4) and human oversight (section 8) matter as much as network controls. Detailed arrangements live in </w:t>
       </w:r>
       <w:r>
         <w:rPr>
@@ -6193,9 +6441,7 @@
       </w:r>
     </w:p>
     <w:p>
-      <w:r>
-        <w:br w:type="page"/>
-      </w:r>
+      <w:r/>
     </w:p>
     <w:p>
       <w:pPr>
@@ -6269,7 +6515,7 @@
                 <w:sz w:val="19"/>
                 <w:szCs w:val="19"/>
               </w:rPr>
-              <w:t xml:space="preserve">Switch on only if your setting permits pupil use, and only once both preconditions are met: (1) a DPIA completed for the specific tools and processing; (2) an age-appropriate AI education plan covering AI literacy, misinformation, deepfakes and responsible use. If pupil use is not permitted, delete this module and keep section 2 as drafted. Enabling pupil use without the preconditions is the commonest way a sound policy becomes indefensible.</w:t>
+              <w:t xml:space="preserve">Switch on only if your setting permits pupil use, and only once both preconditions are met: (1) a DPIA completed for the specific tools and processing; (2) age-appropriate teaching about AI is in place within the curriculum and online safety provision, covering AI literacy, misinformation, deepfakes and responsible use, in line with the whole-school approach to online safety in KCSIE 2026. If pupil use is not permitted, delete this module and keep section 2 as drafted. Enabling pupil use without the preconditions is the commonest way a sound policy becomes indefensible.</w:t>
             </w:r>
           </w:p>
         </w:tc>
@@ -6624,7 +6870,7 @@
           <w:sz w:val="21"/>
           <w:szCs w:val="21"/>
         </w:rPr>
-        <w:t xml:space="preserve"> regulations; work submitted for qualifications must be demonstrably the pupil’s own. Staff monitor for signs of unauthorised use, such as marked, unexplained changes in standard or style, and investigate in line with JCQ guidance; detector output is never proof (section 6.4).</w:t>
+        <w:t xml:space="preserve"> regulations; work submitted for qualifications must be demonstrably the pupil’s own. Staff monitor for signs of unauthorised use, such as marked, unexplained changes in standard or style, and investigate in line with JCQ guidance; detector output is never proof (section 6.4). Web-enabled or recording-capable devices, including smart glasses and earpieces, must not be taken into examinations or controlled assessments, in line with JCQ regulations.</w:t>
       </w:r>
     </w:p>
     <w:p>
@@ -6947,6 +7193,1730 @@
         <w:spacing w:after="110"/>
       </w:pPr>
     </w:p>
+    <w:p>
+      <w:pPr>
+        <w:pStyle w:val="Heading2"/>
+        <w:keepNext/>
+        <w:spacing w:after="130" w:before="260"/>
+      </w:pPr>
+      <w:r>
+        <w:rPr>
+          <w:rFonts w:ascii="Exo 2" w:cs="Exo 2" w:eastAsia="Exo 2" w:hAnsi="Exo 2"/>
+          <w:b/>
+          <w:bCs/>
+          <w:color w:val="2C3E50"/>
+          <w:sz w:val="27"/>
+          <w:szCs w:val="27"/>
+        </w:rPr>
+        <w:t xml:space="preserve">Appendix: legislation and guidance referenced</w:t>
+      </w:r>
+    </w:p>
+    <w:p>
+      <w:pPr>
+        <w:spacing w:after="150" w:line="272"/>
+      </w:pPr>
+      <w:r>
+        <w:rPr>
+          <w:rFonts w:ascii="Poppins" w:cs="Poppins" w:eastAsia="Poppins" w:hAnsi="Poppins"/>
+          <w:color w:val="1A1A1A"/>
+          <w:sz w:val="21"/>
+          <w:szCs w:val="21"/>
+        </w:rPr>
+        <w:t xml:space="preserve">This appendix lists the legislation, statutory guidance and regulatory material that frames this policy, with the sections where each bears on it. It forms part of the published policy. Legislation is available at www.legislation.gov.uk; government and DfE guidance at www.gov.uk; ICO material at ico.org.uk; JCQ guidance at www.jcq.org.uk; Ofcom codes at www.ofcom.org.uk; and UK Safer Internet Centre definitions at saferinternet.org.uk.</w:t>
+      </w:r>
+    </w:p>
+    <w:p>
+      <w:pPr>
+        <w:pStyle w:val="Heading3"/>
+        <w:keepNext/>
+        <w:spacing w:after="100" w:before="190"/>
+      </w:pPr>
+      <w:r>
+        <w:rPr>
+          <w:rFonts w:ascii="Exo 2" w:cs="Exo 2" w:eastAsia="Exo 2" w:hAnsi="Exo 2"/>
+          <w:b/>
+          <w:bCs/>
+          <w:color w:val="34495E"/>
+          <w:sz w:val="23"/>
+          <w:szCs w:val="23"/>
+        </w:rPr>
+        <w:t xml:space="preserve">Primary legislation</w:t>
+      </w:r>
+    </w:p>
+    <w:tbl>
+      <w:tblPr>
+        <w:tblW w:type="dxa" w:w="9520"/>
+        <w:tblBorders>
+          <w:top w:val="single" w:color="BDC3C7" w:sz="4"/>
+          <w:left w:val="single" w:color="BDC3C7" w:sz="4"/>
+          <w:bottom w:val="single" w:color="BDC3C7" w:sz="4"/>
+          <w:right w:val="single" w:color="BDC3C7" w:sz="4"/>
+          <w:insideH w:val="single" w:color="BDC3C7" w:sz="4"/>
+          <w:insideV w:val="single" w:color="BDC3C7" w:sz="4"/>
+        </w:tblBorders>
+      </w:tblPr>
+      <w:tblGrid>
+        <w:gridCol w:w="3100"/>
+        <w:gridCol w:w="6420"/>
+      </w:tblGrid>
+      <w:tr>
+        <w:trPr>
+          <w:tblHeader/>
+        </w:trPr>
+        <w:tc>
+          <w:tcPr>
+            <w:tcW w:type="dxa" w:w="3100"/>
+            <w:shd w:fill="2C3E50" w:val="clear"/>
+            <w:tcMar>
+              <w:top w:type="dxa" w:w="85"/>
+              <w:left w:type="dxa" w:w="125"/>
+              <w:bottom w:type="dxa" w:w="85"/>
+              <w:right w:type="dxa" w:w="125"/>
+            </w:tcMar>
+          </w:tcPr>
+          <w:p>
+            <w:pPr>
+              <w:spacing w:after="0" w:line="250"/>
+            </w:pPr>
+            <w:r>
+              <w:rPr>
+                <w:rFonts w:ascii="Poppins" w:cs="Poppins" w:eastAsia="Poppins" w:hAnsi="Poppins"/>
+                <w:b/>
+                <w:bCs/>
+                <w:color w:val="FFFFFF"/>
+                <w:sz w:val="19"/>
+                <w:szCs w:val="19"/>
+              </w:rPr>
+              <w:t xml:space="preserve">Instrument</w:t>
+            </w:r>
+          </w:p>
+        </w:tc>
+        <w:tc>
+          <w:tcPr>
+            <w:tcW w:type="dxa" w:w="6420"/>
+            <w:shd w:fill="2C3E50" w:val="clear"/>
+            <w:tcMar>
+              <w:top w:type="dxa" w:w="85"/>
+              <w:left w:type="dxa" w:w="125"/>
+              <w:bottom w:type="dxa" w:w="85"/>
+              <w:right w:type="dxa" w:w="125"/>
+            </w:tcMar>
+          </w:tcPr>
+          <w:p>
+            <w:pPr>
+              <w:spacing w:after="0" w:line="250"/>
+            </w:pPr>
+            <w:r>
+              <w:rPr>
+                <w:rFonts w:ascii="Poppins" w:cs="Poppins" w:eastAsia="Poppins" w:hAnsi="Poppins"/>
+                <w:b/>
+                <w:bCs/>
+                <w:color w:val="FFFFFF"/>
+                <w:sz w:val="19"/>
+                <w:szCs w:val="19"/>
+              </w:rPr>
+              <w:t xml:space="preserve">What it is and where it bears on this policy</w:t>
+            </w:r>
+          </w:p>
+        </w:tc>
+      </w:tr>
+      <w:tr>
+        <w:tc>
+          <w:tcPr>
+            <w:tcW w:type="dxa" w:w="3100"/>
+            <w:tcMar>
+              <w:top w:type="dxa" w:w="85"/>
+              <w:left w:type="dxa" w:w="125"/>
+              <w:bottom w:type="dxa" w:w="85"/>
+              <w:right w:type="dxa" w:w="125"/>
+            </w:tcMar>
+          </w:tcPr>
+          <w:p>
+            <w:pPr>
+              <w:spacing w:after="0" w:line="250"/>
+            </w:pPr>
+            <w:r>
+              <w:rPr>
+                <w:rFonts w:ascii="Poppins" w:cs="Poppins" w:eastAsia="Poppins" w:hAnsi="Poppins"/>
+                <w:b/>
+                <w:bCs/>
+                <w:color w:val="1A1A1A"/>
+                <w:sz w:val="19"/>
+                <w:szCs w:val="19"/>
+              </w:rPr>
+              <w:t xml:space="preserve">UK GDPR</w:t>
+            </w:r>
+          </w:p>
+        </w:tc>
+        <w:tc>
+          <w:tcPr>
+            <w:tcW w:type="dxa" w:w="6420"/>
+            <w:tcMar>
+              <w:top w:type="dxa" w:w="85"/>
+              <w:left w:type="dxa" w:w="125"/>
+              <w:bottom w:type="dxa" w:w="85"/>
+              <w:right w:type="dxa" w:w="125"/>
+            </w:tcMar>
+          </w:tcPr>
+          <w:p>
+            <w:pPr>
+              <w:spacing w:after="0" w:line="250"/>
+            </w:pPr>
+            <w:r>
+              <w:rPr>
+                <w:rFonts w:ascii="Poppins" w:cs="Poppins" w:eastAsia="Poppins" w:hAnsi="Poppins"/>
+                <w:color w:val="1A1A1A"/>
+                <w:sz w:val="19"/>
+                <w:szCs w:val="19"/>
+              </w:rPr>
+              <w:t xml:space="preserve">The UK General Data Protection Regulation (Regulation (EU) 2016/679 as retained in UK law), as amended by the Data (Use and Access) Act 2025. The framework for all processing of personal data through AI: sections 6.1, 7 and 10.</w:t>
+            </w:r>
+          </w:p>
+        </w:tc>
+      </w:tr>
+      <w:tr>
+        <w:tc>
+          <w:tcPr>
+            <w:tcW w:type="dxa" w:w="3100"/>
+            <w:tcMar>
+              <w:top w:type="dxa" w:w="85"/>
+              <w:left w:type="dxa" w:w="125"/>
+              <w:bottom w:type="dxa" w:w="85"/>
+              <w:right w:type="dxa" w:w="125"/>
+            </w:tcMar>
+          </w:tcPr>
+          <w:p>
+            <w:pPr>
+              <w:spacing w:after="0" w:line="250"/>
+            </w:pPr>
+            <w:r>
+              <w:rPr>
+                <w:rFonts w:ascii="Poppins" w:cs="Poppins" w:eastAsia="Poppins" w:hAnsi="Poppins"/>
+                <w:b/>
+                <w:bCs/>
+                <w:color w:val="1A1A1A"/>
+                <w:sz w:val="19"/>
+                <w:szCs w:val="19"/>
+              </w:rPr>
+              <w:t xml:space="preserve">Data Protection Act 2018 (c. 12)</w:t>
+            </w:r>
+          </w:p>
+        </w:tc>
+        <w:tc>
+          <w:tcPr>
+            <w:tcW w:type="dxa" w:w="6420"/>
+            <w:tcMar>
+              <w:top w:type="dxa" w:w="85"/>
+              <w:left w:type="dxa" w:w="125"/>
+              <w:bottom w:type="dxa" w:w="85"/>
+              <w:right w:type="dxa" w:w="125"/>
+            </w:tcMar>
+          </w:tcPr>
+          <w:p>
+            <w:pPr>
+              <w:spacing w:after="0" w:line="250"/>
+            </w:pPr>
+            <w:r>
+              <w:rPr>
+                <w:rFonts w:ascii="Poppins" w:cs="Poppins" w:eastAsia="Poppins" w:hAnsi="Poppins"/>
+                <w:color w:val="1A1A1A"/>
+                <w:sz w:val="19"/>
+                <w:szCs w:val="19"/>
+              </w:rPr>
+              <w:t xml:space="preserve">Supplements the UK GDPR, as amended by the Data (Use and Access) Act 2025; the Children’s Code is issued under section 123. Sections 7, 10 and P.2.</w:t>
+            </w:r>
+          </w:p>
+        </w:tc>
+      </w:tr>
+      <w:tr>
+        <w:tc>
+          <w:tcPr>
+            <w:tcW w:type="dxa" w:w="3100"/>
+            <w:tcMar>
+              <w:top w:type="dxa" w:w="85"/>
+              <w:left w:type="dxa" w:w="125"/>
+              <w:bottom w:type="dxa" w:w="85"/>
+              <w:right w:type="dxa" w:w="125"/>
+            </w:tcMar>
+          </w:tcPr>
+          <w:p>
+            <w:pPr>
+              <w:spacing w:after="0" w:line="250"/>
+            </w:pPr>
+            <w:r>
+              <w:rPr>
+                <w:rFonts w:ascii="Poppins" w:cs="Poppins" w:eastAsia="Poppins" w:hAnsi="Poppins"/>
+                <w:b/>
+                <w:bCs/>
+                <w:color w:val="1A1A1A"/>
+                <w:sz w:val="19"/>
+                <w:szCs w:val="19"/>
+              </w:rPr>
+              <w:t xml:space="preserve">Data (Use and Access) Act 2025 (c. 18)</w:t>
+            </w:r>
+          </w:p>
+        </w:tc>
+        <w:tc>
+          <w:tcPr>
+            <w:tcW w:type="dxa" w:w="6420"/>
+            <w:tcMar>
+              <w:top w:type="dxa" w:w="85"/>
+              <w:left w:type="dxa" w:w="125"/>
+              <w:bottom w:type="dxa" w:w="85"/>
+              <w:right w:type="dxa" w:w="125"/>
+            </w:tcMar>
+          </w:tcPr>
+          <w:p>
+            <w:pPr>
+              <w:spacing w:after="0" w:line="250"/>
+            </w:pPr>
+            <w:r>
+              <w:rPr>
+                <w:rFonts w:ascii="Poppins" w:cs="Poppins" w:eastAsia="Poppins" w:hAnsi="Poppins"/>
+                <w:color w:val="1A1A1A"/>
+                <w:sz w:val="19"/>
+                <w:szCs w:val="19"/>
+              </w:rPr>
+              <w:t xml:space="preserve">Amends both of the above, including replacing Article 22 of the UK GDPR with Articles 22A to 22D on automated decision-making and introducing recognised legitimate interests. Section 7.</w:t>
+            </w:r>
+          </w:p>
+        </w:tc>
+      </w:tr>
+      <w:tr>
+        <w:tc>
+          <w:tcPr>
+            <w:tcW w:type="dxa" w:w="3100"/>
+            <w:tcMar>
+              <w:top w:type="dxa" w:w="85"/>
+              <w:left w:type="dxa" w:w="125"/>
+              <w:bottom w:type="dxa" w:w="85"/>
+              <w:right w:type="dxa" w:w="125"/>
+            </w:tcMar>
+          </w:tcPr>
+          <w:p>
+            <w:pPr>
+              <w:spacing w:after="0" w:line="250"/>
+            </w:pPr>
+            <w:r>
+              <w:rPr>
+                <w:rFonts w:ascii="Poppins" w:cs="Poppins" w:eastAsia="Poppins" w:hAnsi="Poppins"/>
+                <w:b/>
+                <w:bCs/>
+                <w:color w:val="1A1A1A"/>
+                <w:sz w:val="19"/>
+                <w:szCs w:val="19"/>
+              </w:rPr>
+              <w:t xml:space="preserve">Online Safety Act 2023 (c. 50)</w:t>
+            </w:r>
+          </w:p>
+        </w:tc>
+        <w:tc>
+          <w:tcPr>
+            <w:tcW w:type="dxa" w:w="6420"/>
+            <w:tcMar>
+              <w:top w:type="dxa" w:w="85"/>
+              <w:left w:type="dxa" w:w="125"/>
+              <w:bottom w:type="dxa" w:w="85"/>
+              <w:right w:type="dxa" w:w="125"/>
+            </w:tcMar>
+          </w:tcPr>
+          <w:p>
+            <w:pPr>
+              <w:spacing w:after="0" w:line="250"/>
+            </w:pPr>
+            <w:r>
+              <w:rPr>
+                <w:rFonts w:ascii="Poppins" w:cs="Poppins" w:eastAsia="Poppins" w:hAnsi="Poppins"/>
+                <w:color w:val="1A1A1A"/>
+                <w:sz w:val="19"/>
+                <w:szCs w:val="19"/>
+              </w:rPr>
+              <w:t xml:space="preserve">Duties on online services to protect children from illegal and harmful content, under which the Ofcom Protection of Children code is made. Section 9.</w:t>
+            </w:r>
+          </w:p>
+        </w:tc>
+      </w:tr>
+      <w:tr>
+        <w:tc>
+          <w:tcPr>
+            <w:tcW w:type="dxa" w:w="3100"/>
+            <w:tcMar>
+              <w:top w:type="dxa" w:w="85"/>
+              <w:left w:type="dxa" w:w="125"/>
+              <w:bottom w:type="dxa" w:w="85"/>
+              <w:right w:type="dxa" w:w="125"/>
+            </w:tcMar>
+          </w:tcPr>
+          <w:p>
+            <w:pPr>
+              <w:spacing w:after="0" w:line="250"/>
+            </w:pPr>
+            <w:r>
+              <w:rPr>
+                <w:rFonts w:ascii="Poppins" w:cs="Poppins" w:eastAsia="Poppins" w:hAnsi="Poppins"/>
+                <w:b/>
+                <w:bCs/>
+                <w:color w:val="1A1A1A"/>
+                <w:sz w:val="19"/>
+                <w:szCs w:val="19"/>
+              </w:rPr>
+              <w:t xml:space="preserve">Crime and Policing Act 2026 (c. 20)</w:t>
+            </w:r>
+          </w:p>
+        </w:tc>
+        <w:tc>
+          <w:tcPr>
+            <w:tcW w:type="dxa" w:w="6420"/>
+            <w:tcMar>
+              <w:top w:type="dxa" w:w="85"/>
+              <w:left w:type="dxa" w:w="125"/>
+              <w:bottom w:type="dxa" w:w="85"/>
+              <w:right w:type="dxa" w:w="125"/>
+            </w:tcMar>
+          </w:tcPr>
+          <w:p>
+            <w:pPr>
+              <w:spacing w:after="0" w:line="250"/>
+            </w:pPr>
+            <w:r>
+              <w:rPr>
+                <w:rFonts w:ascii="Poppins" w:cs="Poppins" w:eastAsia="Poppins" w:hAnsi="Poppins"/>
+                <w:color w:val="1A1A1A"/>
+                <w:sz w:val="19"/>
+                <w:szCs w:val="19"/>
+              </w:rPr>
+              <w:t xml:space="preserve">Received Royal Assent on 29 April 2026; commencement is staged. Creates the offence of making, adapting, supplying or offering nudification tools. Section 9.</w:t>
+            </w:r>
+          </w:p>
+        </w:tc>
+      </w:tr>
+      <w:tr>
+        <w:tc>
+          <w:tcPr>
+            <w:tcW w:type="dxa" w:w="3100"/>
+            <w:tcMar>
+              <w:top w:type="dxa" w:w="85"/>
+              <w:left w:type="dxa" w:w="125"/>
+              <w:bottom w:type="dxa" w:w="85"/>
+              <w:right w:type="dxa" w:w="125"/>
+            </w:tcMar>
+          </w:tcPr>
+          <w:p>
+            <w:pPr>
+              <w:spacing w:after="0" w:line="250"/>
+            </w:pPr>
+            <w:r>
+              <w:rPr>
+                <w:rFonts w:ascii="Poppins" w:cs="Poppins" w:eastAsia="Poppins" w:hAnsi="Poppins"/>
+                <w:b/>
+                <w:bCs/>
+                <w:color w:val="1A1A1A"/>
+                <w:sz w:val="19"/>
+                <w:szCs w:val="19"/>
+              </w:rPr>
+              <w:t xml:space="preserve">Equality Act 2010 (c. 15)</w:t>
+            </w:r>
+          </w:p>
+        </w:tc>
+        <w:tc>
+          <w:tcPr>
+            <w:tcW w:type="dxa" w:w="6420"/>
+            <w:tcMar>
+              <w:top w:type="dxa" w:w="85"/>
+              <w:left w:type="dxa" w:w="125"/>
+              <w:bottom w:type="dxa" w:w="85"/>
+              <w:right w:type="dxa" w:w="125"/>
+            </w:tcMar>
+          </w:tcPr>
+          <w:p>
+            <w:pPr>
+              <w:spacing w:after="0" w:line="250"/>
+            </w:pPr>
+            <w:r>
+              <w:rPr>
+                <w:rFonts w:ascii="Poppins" w:cs="Poppins" w:eastAsia="Poppins" w:hAnsi="Poppins"/>
+                <w:color w:val="1A1A1A"/>
+                <w:sz w:val="19"/>
+                <w:szCs w:val="19"/>
+              </w:rPr>
+              <w:t xml:space="preserve">Prohibits discrimination, including at scale through biased AI; the public sector equality duty is at section 149. Sections 1, 6.4 and 8.</w:t>
+            </w:r>
+          </w:p>
+        </w:tc>
+      </w:tr>
+      <w:tr>
+        <w:tc>
+          <w:tcPr>
+            <w:tcW w:type="dxa" w:w="3100"/>
+            <w:tcMar>
+              <w:top w:type="dxa" w:w="85"/>
+              <w:left w:type="dxa" w:w="125"/>
+              <w:bottom w:type="dxa" w:w="85"/>
+              <w:right w:type="dxa" w:w="125"/>
+            </w:tcMar>
+          </w:tcPr>
+          <w:p>
+            <w:pPr>
+              <w:spacing w:after="0" w:line="250"/>
+            </w:pPr>
+            <w:r>
+              <w:rPr>
+                <w:rFonts w:ascii="Poppins" w:cs="Poppins" w:eastAsia="Poppins" w:hAnsi="Poppins"/>
+                <w:b/>
+                <w:bCs/>
+                <w:color w:val="1A1A1A"/>
+                <w:sz w:val="19"/>
+                <w:szCs w:val="19"/>
+              </w:rPr>
+              <w:t xml:space="preserve">Counter-Terrorism and Security Act 2015 (c. 6)</w:t>
+            </w:r>
+          </w:p>
+        </w:tc>
+        <w:tc>
+          <w:tcPr>
+            <w:tcW w:type="dxa" w:w="6420"/>
+            <w:tcMar>
+              <w:top w:type="dxa" w:w="85"/>
+              <w:left w:type="dxa" w:w="125"/>
+              <w:bottom w:type="dxa" w:w="85"/>
+              <w:right w:type="dxa" w:w="125"/>
+            </w:tcMar>
+          </w:tcPr>
+          <w:p>
+            <w:pPr>
+              <w:spacing w:after="0" w:line="250"/>
+            </w:pPr>
+            <w:r>
+              <w:rPr>
+                <w:rFonts w:ascii="Poppins" w:cs="Poppins" w:eastAsia="Poppins" w:hAnsi="Poppins"/>
+                <w:color w:val="1A1A1A"/>
+                <w:sz w:val="19"/>
+                <w:szCs w:val="19"/>
+              </w:rPr>
+              <w:t xml:space="preserve">Section 26 places the Prevent duty on schools and colleges; the Prevent duty guidance is issued under section 29. Section 9.</w:t>
+            </w:r>
+          </w:p>
+        </w:tc>
+      </w:tr>
+      <w:tr>
+        <w:tc>
+          <w:tcPr>
+            <w:tcW w:type="dxa" w:w="3100"/>
+            <w:tcMar>
+              <w:top w:type="dxa" w:w="85"/>
+              <w:left w:type="dxa" w:w="125"/>
+              <w:bottom w:type="dxa" w:w="85"/>
+              <w:right w:type="dxa" w:w="125"/>
+            </w:tcMar>
+          </w:tcPr>
+          <w:p>
+            <w:pPr>
+              <w:spacing w:after="0" w:line="250"/>
+            </w:pPr>
+            <w:r>
+              <w:rPr>
+                <w:rFonts w:ascii="Poppins" w:cs="Poppins" w:eastAsia="Poppins" w:hAnsi="Poppins"/>
+                <w:b/>
+                <w:bCs/>
+                <w:color w:val="1A1A1A"/>
+                <w:sz w:val="19"/>
+                <w:szCs w:val="19"/>
+              </w:rPr>
+              <w:t xml:space="preserve">Protection of Freedoms Act 2012 (c. 9)</w:t>
+            </w:r>
+          </w:p>
+        </w:tc>
+        <w:tc>
+          <w:tcPr>
+            <w:tcW w:type="dxa" w:w="6420"/>
+            <w:tcMar>
+              <w:top w:type="dxa" w:w="85"/>
+              <w:left w:type="dxa" w:w="125"/>
+              <w:bottom w:type="dxa" w:w="85"/>
+              <w:right w:type="dxa" w:w="125"/>
+            </w:tcMar>
+          </w:tcPr>
+          <w:p>
+            <w:pPr>
+              <w:spacing w:after="0" w:line="250"/>
+            </w:pPr>
+            <w:r>
+              <w:rPr>
+                <w:rFonts w:ascii="Poppins" w:cs="Poppins" w:eastAsia="Poppins" w:hAnsi="Poppins"/>
+                <w:color w:val="1A1A1A"/>
+                <w:sz w:val="19"/>
+                <w:szCs w:val="19"/>
+              </w:rPr>
+              <w:t xml:space="preserve">Sections 26 to 28 require written parental consent before processing a child’s biometric information, with an alternative for those who refuse. Section 6.4.</w:t>
+            </w:r>
+          </w:p>
+        </w:tc>
+      </w:tr>
+      <w:tr>
+        <w:tc>
+          <w:tcPr>
+            <w:tcW w:type="dxa" w:w="3100"/>
+            <w:tcMar>
+              <w:top w:type="dxa" w:w="85"/>
+              <w:left w:type="dxa" w:w="125"/>
+              <w:bottom w:type="dxa" w:w="85"/>
+              <w:right w:type="dxa" w:w="125"/>
+            </w:tcMar>
+          </w:tcPr>
+          <w:p>
+            <w:pPr>
+              <w:spacing w:after="0" w:line="250"/>
+            </w:pPr>
+            <w:r>
+              <w:rPr>
+                <w:rFonts w:ascii="Poppins" w:cs="Poppins" w:eastAsia="Poppins" w:hAnsi="Poppins"/>
+                <w:b/>
+                <w:bCs/>
+                <w:color w:val="1A1A1A"/>
+                <w:sz w:val="19"/>
+                <w:szCs w:val="19"/>
+              </w:rPr>
+              <w:t xml:space="preserve">Freedom of Information Act 2000 (c. 36)</w:t>
+            </w:r>
+          </w:p>
+        </w:tc>
+        <w:tc>
+          <w:tcPr>
+            <w:tcW w:type="dxa" w:w="6420"/>
+            <w:tcMar>
+              <w:top w:type="dxa" w:w="85"/>
+              <w:left w:type="dxa" w:w="125"/>
+              <w:bottom w:type="dxa" w:w="85"/>
+              <w:right w:type="dxa" w:w="125"/>
+            </w:tcMar>
+          </w:tcPr>
+          <w:p>
+            <w:pPr>
+              <w:spacing w:after="0" w:line="250"/>
+            </w:pPr>
+            <w:r>
+              <w:rPr>
+                <w:rFonts w:ascii="Poppins" w:cs="Poppins" w:eastAsia="Poppins" w:hAnsi="Poppins"/>
+                <w:color w:val="1A1A1A"/>
+                <w:sz w:val="19"/>
+                <w:szCs w:val="19"/>
+              </w:rPr>
+              <w:t xml:space="preserve">AI prompts, outputs and interaction logs held by the organisation are potentially disclosable. Section 7.</w:t>
+            </w:r>
+          </w:p>
+        </w:tc>
+      </w:tr>
+      <w:tr>
+        <w:tc>
+          <w:tcPr>
+            <w:tcW w:type="dxa" w:w="3100"/>
+            <w:tcMar>
+              <w:top w:type="dxa" w:w="85"/>
+              <w:left w:type="dxa" w:w="125"/>
+              <w:bottom w:type="dxa" w:w="85"/>
+              <w:right w:type="dxa" w:w="125"/>
+            </w:tcMar>
+          </w:tcPr>
+          <w:p>
+            <w:pPr>
+              <w:spacing w:after="0" w:line="250"/>
+            </w:pPr>
+            <w:r>
+              <w:rPr>
+                <w:rFonts w:ascii="Poppins" w:cs="Poppins" w:eastAsia="Poppins" w:hAnsi="Poppins"/>
+                <w:b/>
+                <w:bCs/>
+                <w:color w:val="1A1A1A"/>
+                <w:sz w:val="19"/>
+                <w:szCs w:val="19"/>
+              </w:rPr>
+              <w:t xml:space="preserve">Copyright, Designs and Patents Act 1988 (c. 48)</w:t>
+            </w:r>
+          </w:p>
+        </w:tc>
+        <w:tc>
+          <w:tcPr>
+            <w:tcW w:type="dxa" w:w="6420"/>
+            <w:tcMar>
+              <w:top w:type="dxa" w:w="85"/>
+              <w:left w:type="dxa" w:w="125"/>
+              <w:bottom w:type="dxa" w:w="85"/>
+              <w:right w:type="dxa" w:w="125"/>
+            </w:tcMar>
+          </w:tcPr>
+          <w:p>
+            <w:pPr>
+              <w:spacing w:after="0" w:line="250"/>
+            </w:pPr>
+            <w:r>
+              <w:rPr>
+                <w:rFonts w:ascii="Poppins" w:cs="Poppins" w:eastAsia="Poppins" w:hAnsi="Poppins"/>
+                <w:color w:val="1A1A1A"/>
+                <w:sz w:val="19"/>
+                <w:szCs w:val="19"/>
+              </w:rPr>
+              <w:t xml:space="preserve">The framework for the third-party rights engaged when material is entered into, or produced by, an AI tool. Section 6.5.</w:t>
+            </w:r>
+          </w:p>
+        </w:tc>
+      </w:tr>
+      <w:tr>
+        <w:tc>
+          <w:tcPr>
+            <w:tcW w:type="dxa" w:w="3100"/>
+            <w:tcMar>
+              <w:top w:type="dxa" w:w="85"/>
+              <w:left w:type="dxa" w:w="125"/>
+              <w:bottom w:type="dxa" w:w="85"/>
+              <w:right w:type="dxa" w:w="125"/>
+            </w:tcMar>
+          </w:tcPr>
+          <w:p>
+            <w:pPr>
+              <w:spacing w:after="0" w:line="250"/>
+            </w:pPr>
+            <w:r>
+              <w:rPr>
+                <w:rFonts w:ascii="Poppins" w:cs="Poppins" w:eastAsia="Poppins" w:hAnsi="Poppins"/>
+                <w:b/>
+                <w:bCs/>
+                <w:color w:val="1A1A1A"/>
+                <w:sz w:val="19"/>
+                <w:szCs w:val="19"/>
+              </w:rPr>
+              <w:t xml:space="preserve">Protection of Children Act 1978 (c. 37) and Coroners and Justice Act 2009 (c. 25)</w:t>
+            </w:r>
+          </w:p>
+        </w:tc>
+        <w:tc>
+          <w:tcPr>
+            <w:tcW w:type="dxa" w:w="6420"/>
+            <w:tcMar>
+              <w:top w:type="dxa" w:w="85"/>
+              <w:left w:type="dxa" w:w="125"/>
+              <w:bottom w:type="dxa" w:w="85"/>
+              <w:right w:type="dxa" w:w="125"/>
+            </w:tcMar>
+          </w:tcPr>
+          <w:p>
+            <w:pPr>
+              <w:spacing w:after="0" w:line="250"/>
+            </w:pPr>
+            <w:r>
+              <w:rPr>
+                <w:rFonts w:ascii="Poppins" w:cs="Poppins" w:eastAsia="Poppins" w:hAnsi="Poppins"/>
+                <w:color w:val="1A1A1A"/>
+                <w:sz w:val="19"/>
+                <w:szCs w:val="19"/>
+              </w:rPr>
+              <w:t xml:space="preserve">Together make indecent and prohibited images of children criminal in all forms, including pseudo-photographs and AI-generated imagery. Section 9.</w:t>
+            </w:r>
+          </w:p>
+        </w:tc>
+      </w:tr>
+      <w:tr>
+        <w:tc>
+          <w:tcPr>
+            <w:tcW w:type="dxa" w:w="3100"/>
+            <w:tcMar>
+              <w:top w:type="dxa" w:w="85"/>
+              <w:left w:type="dxa" w:w="125"/>
+              <w:bottom w:type="dxa" w:w="85"/>
+              <w:right w:type="dxa" w:w="125"/>
+            </w:tcMar>
+          </w:tcPr>
+          <w:p>
+            <w:pPr>
+              <w:spacing w:after="0" w:line="250"/>
+            </w:pPr>
+            <w:r>
+              <w:rPr>
+                <w:rFonts w:ascii="Poppins" w:cs="Poppins" w:eastAsia="Poppins" w:hAnsi="Poppins"/>
+                <w:b/>
+                <w:bCs/>
+                <w:color w:val="1A1A1A"/>
+                <w:sz w:val="19"/>
+                <w:szCs w:val="19"/>
+              </w:rPr>
+              <w:t xml:space="preserve">Sexual Offences Act 2003 (c. 42)</w:t>
+            </w:r>
+          </w:p>
+        </w:tc>
+        <w:tc>
+          <w:tcPr>
+            <w:tcW w:type="dxa" w:w="6420"/>
+            <w:tcMar>
+              <w:top w:type="dxa" w:w="85"/>
+              <w:left w:type="dxa" w:w="125"/>
+              <w:bottom w:type="dxa" w:w="85"/>
+              <w:right w:type="dxa" w:w="125"/>
+            </w:tcMar>
+          </w:tcPr>
+          <w:p>
+            <w:pPr>
+              <w:spacing w:after="0" w:line="250"/>
+            </w:pPr>
+            <w:r>
+              <w:rPr>
+                <w:rFonts w:ascii="Poppins" w:cs="Poppins" w:eastAsia="Poppins" w:hAnsi="Poppins"/>
+                <w:color w:val="1A1A1A"/>
+                <w:sz w:val="19"/>
+                <w:szCs w:val="19"/>
+              </w:rPr>
+              <w:t xml:space="preserve">The intimate image offences at sections 66A to 66D, inserted by the Online Safety Act 2023, criminalise sharing intimate images without consent, including AI-generated ones; sections 66E to 66H, inserted by the Data (Use and Access) Act 2025 and in force from 6 February 2026, criminalise creating, or requesting the creation of, purported intimate images. Section 9.</w:t>
+            </w:r>
+          </w:p>
+        </w:tc>
+      </w:tr>
+    </w:tbl>
+    <w:p>
+      <w:pPr>
+        <w:pStyle w:val="Heading3"/>
+        <w:keepNext/>
+        <w:spacing w:after="100" w:before="190"/>
+      </w:pPr>
+      <w:r>
+        <w:rPr>
+          <w:rFonts w:ascii="Exo 2" w:cs="Exo 2" w:eastAsia="Exo 2" w:hAnsi="Exo 2"/>
+          <w:b/>
+          <w:bCs/>
+          <w:color w:val="34495E"/>
+          <w:sz w:val="23"/>
+          <w:szCs w:val="23"/>
+        </w:rPr>
+        <w:t xml:space="preserve">Statutory guidance and codes of practice</w:t>
+      </w:r>
+    </w:p>
+    <w:tbl>
+      <w:tblPr>
+        <w:tblW w:type="dxa" w:w="9520"/>
+        <w:tblBorders>
+          <w:top w:val="single" w:color="BDC3C7" w:sz="4"/>
+          <w:left w:val="single" w:color="BDC3C7" w:sz="4"/>
+          <w:bottom w:val="single" w:color="BDC3C7" w:sz="4"/>
+          <w:right w:val="single" w:color="BDC3C7" w:sz="4"/>
+          <w:insideH w:val="single" w:color="BDC3C7" w:sz="4"/>
+          <w:insideV w:val="single" w:color="BDC3C7" w:sz="4"/>
+        </w:tblBorders>
+      </w:tblPr>
+      <w:tblGrid>
+        <w:gridCol w:w="3100"/>
+        <w:gridCol w:w="6420"/>
+      </w:tblGrid>
+      <w:tr>
+        <w:trPr>
+          <w:tblHeader/>
+        </w:trPr>
+        <w:tc>
+          <w:tcPr>
+            <w:tcW w:type="dxa" w:w="3100"/>
+            <w:shd w:fill="2C3E50" w:val="clear"/>
+            <w:tcMar>
+              <w:top w:type="dxa" w:w="85"/>
+              <w:left w:type="dxa" w:w="125"/>
+              <w:bottom w:type="dxa" w:w="85"/>
+              <w:right w:type="dxa" w:w="125"/>
+            </w:tcMar>
+          </w:tcPr>
+          <w:p>
+            <w:pPr>
+              <w:spacing w:after="0" w:line="250"/>
+            </w:pPr>
+            <w:r>
+              <w:rPr>
+                <w:rFonts w:ascii="Poppins" w:cs="Poppins" w:eastAsia="Poppins" w:hAnsi="Poppins"/>
+                <w:b/>
+                <w:bCs/>
+                <w:color w:val="FFFFFF"/>
+                <w:sz w:val="19"/>
+                <w:szCs w:val="19"/>
+              </w:rPr>
+              <w:t xml:space="preserve">Instrument</w:t>
+            </w:r>
+          </w:p>
+        </w:tc>
+        <w:tc>
+          <w:tcPr>
+            <w:tcW w:type="dxa" w:w="6420"/>
+            <w:shd w:fill="2C3E50" w:val="clear"/>
+            <w:tcMar>
+              <w:top w:type="dxa" w:w="85"/>
+              <w:left w:type="dxa" w:w="125"/>
+              <w:bottom w:type="dxa" w:w="85"/>
+              <w:right w:type="dxa" w:w="125"/>
+            </w:tcMar>
+          </w:tcPr>
+          <w:p>
+            <w:pPr>
+              <w:spacing w:after="0" w:line="250"/>
+            </w:pPr>
+            <w:r>
+              <w:rPr>
+                <w:rFonts w:ascii="Poppins" w:cs="Poppins" w:eastAsia="Poppins" w:hAnsi="Poppins"/>
+                <w:b/>
+                <w:bCs/>
+                <w:color w:val="FFFFFF"/>
+                <w:sz w:val="19"/>
+                <w:szCs w:val="19"/>
+              </w:rPr>
+              <w:t xml:space="preserve">What it is and where it bears on this policy</w:t>
+            </w:r>
+          </w:p>
+        </w:tc>
+      </w:tr>
+      <w:tr>
+        <w:tc>
+          <w:tcPr>
+            <w:tcW w:type="dxa" w:w="3100"/>
+            <w:tcMar>
+              <w:top w:type="dxa" w:w="85"/>
+              <w:left w:type="dxa" w:w="125"/>
+              <w:bottom w:type="dxa" w:w="85"/>
+              <w:right w:type="dxa" w:w="125"/>
+            </w:tcMar>
+          </w:tcPr>
+          <w:p>
+            <w:pPr>
+              <w:spacing w:after="0" w:line="250"/>
+            </w:pPr>
+            <w:r>
+              <w:rPr>
+                <w:rFonts w:ascii="Poppins" w:cs="Poppins" w:eastAsia="Poppins" w:hAnsi="Poppins"/>
+                <w:b/>
+                <w:bCs/>
+                <w:color w:val="1A1A1A"/>
+                <w:sz w:val="19"/>
+                <w:szCs w:val="19"/>
+              </w:rPr>
+              <w:t xml:space="preserve">Keeping Children Safe in Education 2026</w:t>
+            </w:r>
+          </w:p>
+        </w:tc>
+        <w:tc>
+          <w:tcPr>
+            <w:tcW w:type="dxa" w:w="6420"/>
+            <w:tcMar>
+              <w:top w:type="dxa" w:w="85"/>
+              <w:left w:type="dxa" w:w="125"/>
+              <w:bottom w:type="dxa" w:w="85"/>
+              <w:right w:type="dxa" w:w="125"/>
+            </w:tcMar>
+          </w:tcPr>
+          <w:p>
+            <w:pPr>
+              <w:spacing w:after="0" w:line="250"/>
+            </w:pPr>
+            <w:r>
+              <w:rPr>
+                <w:rFonts w:ascii="Poppins" w:cs="Poppins" w:eastAsia="Poppins" w:hAnsi="Poppins"/>
+                <w:color w:val="1A1A1A"/>
+                <w:sz w:val="19"/>
+                <w:szCs w:val="19"/>
+              </w:rPr>
+              <w:t xml:space="preserve">DfE statutory safeguarding guidance in force from 1 September 2026; names AI within its four areas of online risk. Section 9 and throughout.</w:t>
+            </w:r>
+          </w:p>
+        </w:tc>
+      </w:tr>
+      <w:tr>
+        <w:tc>
+          <w:tcPr>
+            <w:tcW w:type="dxa" w:w="3100"/>
+            <w:tcMar>
+              <w:top w:type="dxa" w:w="85"/>
+              <w:left w:type="dxa" w:w="125"/>
+              <w:bottom w:type="dxa" w:w="85"/>
+              <w:right w:type="dxa" w:w="125"/>
+            </w:tcMar>
+          </w:tcPr>
+          <w:p>
+            <w:pPr>
+              <w:spacing w:after="0" w:line="250"/>
+            </w:pPr>
+            <w:r>
+              <w:rPr>
+                <w:rFonts w:ascii="Poppins" w:cs="Poppins" w:eastAsia="Poppins" w:hAnsi="Poppins"/>
+                <w:b/>
+                <w:bCs/>
+                <w:color w:val="1A1A1A"/>
+                <w:sz w:val="19"/>
+                <w:szCs w:val="19"/>
+              </w:rPr>
+              <w:t xml:space="preserve">Working Together to Safeguard Children 2026</w:t>
+            </w:r>
+          </w:p>
+        </w:tc>
+        <w:tc>
+          <w:tcPr>
+            <w:tcW w:type="dxa" w:w="6420"/>
+            <w:tcMar>
+              <w:top w:type="dxa" w:w="85"/>
+              <w:left w:type="dxa" w:w="125"/>
+              <w:bottom w:type="dxa" w:w="85"/>
+              <w:right w:type="dxa" w:w="125"/>
+            </w:tcMar>
+          </w:tcPr>
+          <w:p>
+            <w:pPr>
+              <w:spacing w:after="0" w:line="250"/>
+            </w:pPr>
+            <w:r>
+              <w:rPr>
+                <w:rFonts w:ascii="Poppins" w:cs="Poppins" w:eastAsia="Poppins" w:hAnsi="Poppins"/>
+                <w:color w:val="1A1A1A"/>
+                <w:sz w:val="19"/>
+                <w:szCs w:val="19"/>
+              </w:rPr>
+              <w:t xml:space="preserve">The statutory framework for multi-agency safeguarding action. Section 9.</w:t>
+            </w:r>
+          </w:p>
+        </w:tc>
+      </w:tr>
+      <w:tr>
+        <w:tc>
+          <w:tcPr>
+            <w:tcW w:type="dxa" w:w="3100"/>
+            <w:tcMar>
+              <w:top w:type="dxa" w:w="85"/>
+              <w:left w:type="dxa" w:w="125"/>
+              <w:bottom w:type="dxa" w:w="85"/>
+              <w:right w:type="dxa" w:w="125"/>
+            </w:tcMar>
+          </w:tcPr>
+          <w:p>
+            <w:pPr>
+              <w:spacing w:after="0" w:line="250"/>
+            </w:pPr>
+            <w:r>
+              <w:rPr>
+                <w:rFonts w:ascii="Poppins" w:cs="Poppins" w:eastAsia="Poppins" w:hAnsi="Poppins"/>
+                <w:b/>
+                <w:bCs/>
+                <w:color w:val="1A1A1A"/>
+                <w:sz w:val="19"/>
+                <w:szCs w:val="19"/>
+              </w:rPr>
+              <w:t xml:space="preserve">Prevent duty guidance for England and Wales (2023)</w:t>
+            </w:r>
+          </w:p>
+        </w:tc>
+        <w:tc>
+          <w:tcPr>
+            <w:tcW w:type="dxa" w:w="6420"/>
+            <w:tcMar>
+              <w:top w:type="dxa" w:w="85"/>
+              <w:left w:type="dxa" w:w="125"/>
+              <w:bottom w:type="dxa" w:w="85"/>
+              <w:right w:type="dxa" w:w="125"/>
+            </w:tcMar>
+          </w:tcPr>
+          <w:p>
+            <w:pPr>
+              <w:spacing w:after="0" w:line="250"/>
+            </w:pPr>
+            <w:r>
+              <w:rPr>
+                <w:rFonts w:ascii="Poppins" w:cs="Poppins" w:eastAsia="Poppins" w:hAnsi="Poppins"/>
+                <w:color w:val="1A1A1A"/>
+                <w:sz w:val="19"/>
+                <w:szCs w:val="19"/>
+              </w:rPr>
+              <w:t xml:space="preserve">Statutory guidance on the Prevent duty, including risks from online and AI-generated content. Section 9.</w:t>
+            </w:r>
+          </w:p>
+        </w:tc>
+      </w:tr>
+      <w:tr>
+        <w:tc>
+          <w:tcPr>
+            <w:tcW w:type="dxa" w:w="3100"/>
+            <w:tcMar>
+              <w:top w:type="dxa" w:w="85"/>
+              <w:left w:type="dxa" w:w="125"/>
+              <w:bottom w:type="dxa" w:w="85"/>
+              <w:right w:type="dxa" w:w="125"/>
+            </w:tcMar>
+          </w:tcPr>
+          <w:p>
+            <w:pPr>
+              <w:spacing w:after="0" w:line="250"/>
+            </w:pPr>
+            <w:r>
+              <w:rPr>
+                <w:rFonts w:ascii="Poppins" w:cs="Poppins" w:eastAsia="Poppins" w:hAnsi="Poppins"/>
+                <w:b/>
+                <w:bCs/>
+                <w:color w:val="1A1A1A"/>
+                <w:sz w:val="19"/>
+                <w:szCs w:val="19"/>
+              </w:rPr>
+              <w:t xml:space="preserve">ICO Age appropriate design code (the Children’s Code)</w:t>
+            </w:r>
+          </w:p>
+        </w:tc>
+        <w:tc>
+          <w:tcPr>
+            <w:tcW w:type="dxa" w:w="6420"/>
+            <w:tcMar>
+              <w:top w:type="dxa" w:w="85"/>
+              <w:left w:type="dxa" w:w="125"/>
+              <w:bottom w:type="dxa" w:w="85"/>
+              <w:right w:type="dxa" w:w="125"/>
+            </w:tcMar>
+          </w:tcPr>
+          <w:p>
+            <w:pPr>
+              <w:spacing w:after="0" w:line="250"/>
+            </w:pPr>
+            <w:r>
+              <w:rPr>
+                <w:rFonts w:ascii="Poppins" w:cs="Poppins" w:eastAsia="Poppins" w:hAnsi="Poppins"/>
+                <w:color w:val="1A1A1A"/>
+                <w:sz w:val="19"/>
+                <w:szCs w:val="19"/>
+              </w:rPr>
+              <w:t xml:space="preserve">Statutory code of practice for online services likely to be accessed by children: best interests first, high privacy by default, profiling off by default. Sections 10 and P.2.</w:t>
+            </w:r>
+          </w:p>
+        </w:tc>
+      </w:tr>
+    </w:tbl>
+    <w:p>
+      <w:pPr>
+        <w:pStyle w:val="Heading3"/>
+        <w:keepNext/>
+        <w:spacing w:after="100" w:before="190"/>
+      </w:pPr>
+      <w:r>
+        <w:rPr>
+          <w:rFonts w:ascii="Exo 2" w:cs="Exo 2" w:eastAsia="Exo 2" w:hAnsi="Exo 2"/>
+          <w:b/>
+          <w:bCs/>
+          <w:color w:val="34495E"/>
+          <w:sz w:val="23"/>
+          <w:szCs w:val="23"/>
+        </w:rPr>
+        <w:t xml:space="preserve">Regulatory, inspection and sector guidance</w:t>
+      </w:r>
+    </w:p>
+    <w:tbl>
+      <w:tblPr>
+        <w:tblW w:type="dxa" w:w="9520"/>
+        <w:tblBorders>
+          <w:top w:val="single" w:color="BDC3C7" w:sz="4"/>
+          <w:left w:val="single" w:color="BDC3C7" w:sz="4"/>
+          <w:bottom w:val="single" w:color="BDC3C7" w:sz="4"/>
+          <w:right w:val="single" w:color="BDC3C7" w:sz="4"/>
+          <w:insideH w:val="single" w:color="BDC3C7" w:sz="4"/>
+          <w:insideV w:val="single" w:color="BDC3C7" w:sz="4"/>
+        </w:tblBorders>
+      </w:tblPr>
+      <w:tblGrid>
+        <w:gridCol w:w="3100"/>
+        <w:gridCol w:w="6420"/>
+      </w:tblGrid>
+      <w:tr>
+        <w:trPr>
+          <w:tblHeader/>
+        </w:trPr>
+        <w:tc>
+          <w:tcPr>
+            <w:tcW w:type="dxa" w:w="3100"/>
+            <w:shd w:fill="2C3E50" w:val="clear"/>
+            <w:tcMar>
+              <w:top w:type="dxa" w:w="85"/>
+              <w:left w:type="dxa" w:w="125"/>
+              <w:bottom w:type="dxa" w:w="85"/>
+              <w:right w:type="dxa" w:w="125"/>
+            </w:tcMar>
+          </w:tcPr>
+          <w:p>
+            <w:pPr>
+              <w:spacing w:after="0" w:line="250"/>
+            </w:pPr>
+            <w:r>
+              <w:rPr>
+                <w:rFonts w:ascii="Poppins" w:cs="Poppins" w:eastAsia="Poppins" w:hAnsi="Poppins"/>
+                <w:b/>
+                <w:bCs/>
+                <w:color w:val="FFFFFF"/>
+                <w:sz w:val="19"/>
+                <w:szCs w:val="19"/>
+              </w:rPr>
+              <w:t xml:space="preserve">Instrument</w:t>
+            </w:r>
+          </w:p>
+        </w:tc>
+        <w:tc>
+          <w:tcPr>
+            <w:tcW w:type="dxa" w:w="6420"/>
+            <w:shd w:fill="2C3E50" w:val="clear"/>
+            <w:tcMar>
+              <w:top w:type="dxa" w:w="85"/>
+              <w:left w:type="dxa" w:w="125"/>
+              <w:bottom w:type="dxa" w:w="85"/>
+              <w:right w:type="dxa" w:w="125"/>
+            </w:tcMar>
+          </w:tcPr>
+          <w:p>
+            <w:pPr>
+              <w:spacing w:after="0" w:line="250"/>
+            </w:pPr>
+            <w:r>
+              <w:rPr>
+                <w:rFonts w:ascii="Poppins" w:cs="Poppins" w:eastAsia="Poppins" w:hAnsi="Poppins"/>
+                <w:b/>
+                <w:bCs/>
+                <w:color w:val="FFFFFF"/>
+                <w:sz w:val="19"/>
+                <w:szCs w:val="19"/>
+              </w:rPr>
+              <w:t xml:space="preserve">What it is and where it bears on this policy</w:t>
+            </w:r>
+          </w:p>
+        </w:tc>
+      </w:tr>
+      <w:tr>
+        <w:tc>
+          <w:tcPr>
+            <w:tcW w:type="dxa" w:w="3100"/>
+            <w:tcMar>
+              <w:top w:type="dxa" w:w="85"/>
+              <w:left w:type="dxa" w:w="125"/>
+              <w:bottom w:type="dxa" w:w="85"/>
+              <w:right w:type="dxa" w:w="125"/>
+            </w:tcMar>
+          </w:tcPr>
+          <w:p>
+            <w:pPr>
+              <w:spacing w:after="0" w:line="250"/>
+            </w:pPr>
+            <w:r>
+              <w:rPr>
+                <w:rFonts w:ascii="Poppins" w:cs="Poppins" w:eastAsia="Poppins" w:hAnsi="Poppins"/>
+                <w:b/>
+                <w:bCs/>
+                <w:color w:val="1A1A1A"/>
+                <w:sz w:val="19"/>
+                <w:szCs w:val="19"/>
+              </w:rPr>
+              <w:t xml:space="preserve">DfE: generative AI in education</w:t>
+            </w:r>
+          </w:p>
+        </w:tc>
+        <w:tc>
+          <w:tcPr>
+            <w:tcW w:type="dxa" w:w="6420"/>
+            <w:tcMar>
+              <w:top w:type="dxa" w:w="85"/>
+              <w:left w:type="dxa" w:w="125"/>
+              <w:bottom w:type="dxa" w:w="85"/>
+              <w:right w:type="dxa" w:w="125"/>
+            </w:tcMar>
+          </w:tcPr>
+          <w:p>
+            <w:pPr>
+              <w:spacing w:after="0" w:line="250"/>
+            </w:pPr>
+            <w:r>
+              <w:rPr>
+                <w:rFonts w:ascii="Poppins" w:cs="Poppins" w:eastAsia="Poppins" w:hAnsi="Poppins"/>
+                <w:color w:val="1A1A1A"/>
+                <w:sz w:val="19"/>
+                <w:szCs w:val="19"/>
+              </w:rPr>
+              <w:t xml:space="preserve">The DfE position on the use of generative AI in schools and colleges. Sections 1, 5 and 10.</w:t>
+            </w:r>
+          </w:p>
+        </w:tc>
+      </w:tr>
+      <w:tr>
+        <w:tc>
+          <w:tcPr>
+            <w:tcW w:type="dxa" w:w="3100"/>
+            <w:tcMar>
+              <w:top w:type="dxa" w:w="85"/>
+              <w:left w:type="dxa" w:w="125"/>
+              <w:bottom w:type="dxa" w:w="85"/>
+              <w:right w:type="dxa" w:w="125"/>
+            </w:tcMar>
+          </w:tcPr>
+          <w:p>
+            <w:pPr>
+              <w:spacing w:after="0" w:line="250"/>
+            </w:pPr>
+            <w:r>
+              <w:rPr>
+                <w:rFonts w:ascii="Poppins" w:cs="Poppins" w:eastAsia="Poppins" w:hAnsi="Poppins"/>
+                <w:b/>
+                <w:bCs/>
+                <w:color w:val="1A1A1A"/>
+                <w:sz w:val="19"/>
+                <w:szCs w:val="19"/>
+              </w:rPr>
+              <w:t xml:space="preserve">DfE: generative AI product safety standards (January 2026)</w:t>
+            </w:r>
+          </w:p>
+        </w:tc>
+        <w:tc>
+          <w:tcPr>
+            <w:tcW w:type="dxa" w:w="6420"/>
+            <w:tcMar>
+              <w:top w:type="dxa" w:w="85"/>
+              <w:left w:type="dxa" w:w="125"/>
+              <w:bottom w:type="dxa" w:w="85"/>
+              <w:right w:type="dxa" w:w="125"/>
+            </w:tcMar>
+          </w:tcPr>
+          <w:p>
+            <w:pPr>
+              <w:spacing w:after="0" w:line="250"/>
+            </w:pPr>
+            <w:r>
+              <w:rPr>
+                <w:rFonts w:ascii="Poppins" w:cs="Poppins" w:eastAsia="Poppins" w:hAnsi="Poppins"/>
+                <w:color w:val="1A1A1A"/>
+                <w:sz w:val="19"/>
+                <w:szCs w:val="19"/>
+              </w:rPr>
+              <w:t xml:space="preserve">The standards every tool is checked against at the approval gate and in the impact assessment. Section 10.</w:t>
+            </w:r>
+          </w:p>
+        </w:tc>
+      </w:tr>
+      <w:tr>
+        <w:tc>
+          <w:tcPr>
+            <w:tcW w:type="dxa" w:w="3100"/>
+            <w:tcMar>
+              <w:top w:type="dxa" w:w="85"/>
+              <w:left w:type="dxa" w:w="125"/>
+              <w:bottom w:type="dxa" w:w="85"/>
+              <w:right w:type="dxa" w:w="125"/>
+            </w:tcMar>
+          </w:tcPr>
+          <w:p>
+            <w:pPr>
+              <w:spacing w:after="0" w:line="250"/>
+            </w:pPr>
+            <w:r>
+              <w:rPr>
+                <w:rFonts w:ascii="Poppins" w:cs="Poppins" w:eastAsia="Poppins" w:hAnsi="Poppins"/>
+                <w:b/>
+                <w:bCs/>
+                <w:color w:val="1A1A1A"/>
+                <w:sz w:val="19"/>
+                <w:szCs w:val="19"/>
+              </w:rPr>
+              <w:t xml:space="preserve">DfE: digital and technology standards</w:t>
+            </w:r>
+          </w:p>
+        </w:tc>
+        <w:tc>
+          <w:tcPr>
+            <w:tcW w:type="dxa" w:w="6420"/>
+            <w:tcMar>
+              <w:top w:type="dxa" w:w="85"/>
+              <w:left w:type="dxa" w:w="125"/>
+              <w:bottom w:type="dxa" w:w="85"/>
+              <w:right w:type="dxa" w:w="125"/>
+            </w:tcMar>
+          </w:tcPr>
+          <w:p>
+            <w:pPr>
+              <w:spacing w:after="0" w:line="250"/>
+            </w:pPr>
+            <w:r>
+              <w:rPr>
+                <w:rFonts w:ascii="Poppins" w:cs="Poppins" w:eastAsia="Poppins" w:hAnsi="Poppins"/>
+                <w:color w:val="1A1A1A"/>
+                <w:sz w:val="19"/>
+                <w:szCs w:val="19"/>
+              </w:rPr>
+              <w:t xml:space="preserve">The filtering and monitoring, cyber security, and digital leadership and governance standards for schools and colleges. Sections 7 and 12.</w:t>
+            </w:r>
+          </w:p>
+        </w:tc>
+      </w:tr>
+      <w:tr>
+        <w:tc>
+          <w:tcPr>
+            <w:tcW w:type="dxa" w:w="3100"/>
+            <w:tcMar>
+              <w:top w:type="dxa" w:w="85"/>
+              <w:left w:type="dxa" w:w="125"/>
+              <w:bottom w:type="dxa" w:w="85"/>
+              <w:right w:type="dxa" w:w="125"/>
+            </w:tcMar>
+          </w:tcPr>
+          <w:p>
+            <w:pPr>
+              <w:spacing w:after="0" w:line="250"/>
+            </w:pPr>
+            <w:r>
+              <w:rPr>
+                <w:rFonts w:ascii="Poppins" w:cs="Poppins" w:eastAsia="Poppins" w:hAnsi="Poppins"/>
+                <w:b/>
+                <w:bCs/>
+                <w:color w:val="1A1A1A"/>
+                <w:sz w:val="19"/>
+                <w:szCs w:val="19"/>
+              </w:rPr>
+              <w:t xml:space="preserve">DfE: data protection in schools</w:t>
+            </w:r>
+          </w:p>
+        </w:tc>
+        <w:tc>
+          <w:tcPr>
+            <w:tcW w:type="dxa" w:w="6420"/>
+            <w:tcMar>
+              <w:top w:type="dxa" w:w="85"/>
+              <w:left w:type="dxa" w:w="125"/>
+              <w:bottom w:type="dxa" w:w="85"/>
+              <w:right w:type="dxa" w:w="125"/>
+            </w:tcMar>
+          </w:tcPr>
+          <w:p>
+            <w:pPr>
+              <w:spacing w:after="0" w:line="250"/>
+            </w:pPr>
+            <w:r>
+              <w:rPr>
+                <w:rFonts w:ascii="Poppins" w:cs="Poppins" w:eastAsia="Poppins" w:hAnsi="Poppins"/>
+                <w:color w:val="1A1A1A"/>
+                <w:sz w:val="19"/>
+                <w:szCs w:val="19"/>
+              </w:rPr>
+              <w:t xml:space="preserve">The DfE’s operational data protection guidance for schools and colleges, sitting alongside the ICO material. Section 7.</w:t>
+            </w:r>
+          </w:p>
+        </w:tc>
+      </w:tr>
+      <w:tr>
+        <w:tc>
+          <w:tcPr>
+            <w:tcW w:type="dxa" w:w="3100"/>
+            <w:tcMar>
+              <w:top w:type="dxa" w:w="85"/>
+              <w:left w:type="dxa" w:w="125"/>
+              <w:bottom w:type="dxa" w:w="85"/>
+              <w:right w:type="dxa" w:w="125"/>
+            </w:tcMar>
+          </w:tcPr>
+          <w:p>
+            <w:pPr>
+              <w:spacing w:after="0" w:line="250"/>
+            </w:pPr>
+            <w:r>
+              <w:rPr>
+                <w:rFonts w:ascii="Poppins" w:cs="Poppins" w:eastAsia="Poppins" w:hAnsi="Poppins"/>
+                <w:b/>
+                <w:bCs/>
+                <w:color w:val="1A1A1A"/>
+                <w:sz w:val="19"/>
+                <w:szCs w:val="19"/>
+              </w:rPr>
+              <w:t xml:space="preserve">ICO: AI guidance and risk toolkit</w:t>
+            </w:r>
+          </w:p>
+        </w:tc>
+        <w:tc>
+          <w:tcPr>
+            <w:tcW w:type="dxa" w:w="6420"/>
+            <w:tcMar>
+              <w:top w:type="dxa" w:w="85"/>
+              <w:left w:type="dxa" w:w="125"/>
+              <w:bottom w:type="dxa" w:w="85"/>
+              <w:right w:type="dxa" w:w="125"/>
+            </w:tcMar>
+          </w:tcPr>
+          <w:p>
+            <w:pPr>
+              <w:spacing w:after="0" w:line="250"/>
+            </w:pPr>
+            <w:r>
+              <w:rPr>
+                <w:rFonts w:ascii="Poppins" w:cs="Poppins" w:eastAsia="Poppins" w:hAnsi="Poppins"/>
+                <w:color w:val="1A1A1A"/>
+                <w:sz w:val="19"/>
+                <w:szCs w:val="19"/>
+              </w:rPr>
+              <w:t xml:space="preserve">The ICO guidance on AI and data protection and the AI and data protection risk toolkit, which shape the impact assessment. Sections 7 and 10.</w:t>
+            </w:r>
+          </w:p>
+        </w:tc>
+      </w:tr>
+      <w:tr>
+        <w:tc>
+          <w:tcPr>
+            <w:tcW w:type="dxa" w:w="3100"/>
+            <w:tcMar>
+              <w:top w:type="dxa" w:w="85"/>
+              <w:left w:type="dxa" w:w="125"/>
+              <w:bottom w:type="dxa" w:w="85"/>
+              <w:right w:type="dxa" w:w="125"/>
+            </w:tcMar>
+          </w:tcPr>
+          <w:p>
+            <w:pPr>
+              <w:spacing w:after="0" w:line="250"/>
+            </w:pPr>
+            <w:r>
+              <w:rPr>
+                <w:rFonts w:ascii="Poppins" w:cs="Poppins" w:eastAsia="Poppins" w:hAnsi="Poppins"/>
+                <w:b/>
+                <w:bCs/>
+                <w:color w:val="1A1A1A"/>
+                <w:sz w:val="19"/>
+                <w:szCs w:val="19"/>
+              </w:rPr>
+              <w:t xml:space="preserve">JCQ: AI Use in Assessments</w:t>
+            </w:r>
+          </w:p>
+        </w:tc>
+        <w:tc>
+          <w:tcPr>
+            <w:tcW w:type="dxa" w:w="6420"/>
+            <w:tcMar>
+              <w:top w:type="dxa" w:w="85"/>
+              <w:left w:type="dxa" w:w="125"/>
+              <w:bottom w:type="dxa" w:w="85"/>
+              <w:right w:type="dxa" w:w="125"/>
+            </w:tcMar>
+          </w:tcPr>
+          <w:p>
+            <w:pPr>
+              <w:spacing w:after="0" w:line="250"/>
+            </w:pPr>
+            <w:r>
+              <w:rPr>
+                <w:rFonts w:ascii="Poppins" w:cs="Poppins" w:eastAsia="Poppins" w:hAnsi="Poppins"/>
+                <w:color w:val="1A1A1A"/>
+                <w:sz w:val="19"/>
+                <w:szCs w:val="19"/>
+              </w:rPr>
+              <w:t xml:space="preserve">Joint Council for Qualifications guidance on AI in work contributing to qualifications; check the current edition and any awarding body or Ofqual materials that apply. Sections 6.3, 6.4 and P.3.</w:t>
+            </w:r>
+          </w:p>
+        </w:tc>
+      </w:tr>
+      <w:tr>
+        <w:tc>
+          <w:tcPr>
+            <w:tcW w:type="dxa" w:w="3100"/>
+            <w:tcMar>
+              <w:top w:type="dxa" w:w="85"/>
+              <w:left w:type="dxa" w:w="125"/>
+              <w:bottom w:type="dxa" w:w="85"/>
+              <w:right w:type="dxa" w:w="125"/>
+            </w:tcMar>
+          </w:tcPr>
+          <w:p>
+            <w:pPr>
+              <w:spacing w:after="0" w:line="250"/>
+            </w:pPr>
+            <w:r>
+              <w:rPr>
+                <w:rFonts w:ascii="Poppins" w:cs="Poppins" w:eastAsia="Poppins" w:hAnsi="Poppins"/>
+                <w:b/>
+                <w:bCs/>
+                <w:color w:val="1A1A1A"/>
+                <w:sz w:val="19"/>
+                <w:szCs w:val="19"/>
+              </w:rPr>
+              <w:t xml:space="preserve">Ofcom: Protection of Children code of practice</w:t>
+            </w:r>
+          </w:p>
+        </w:tc>
+        <w:tc>
+          <w:tcPr>
+            <w:tcW w:type="dxa" w:w="6420"/>
+            <w:tcMar>
+              <w:top w:type="dxa" w:w="85"/>
+              <w:left w:type="dxa" w:w="125"/>
+              <w:bottom w:type="dxa" w:w="85"/>
+              <w:right w:type="dxa" w:w="125"/>
+            </w:tcMar>
+          </w:tcPr>
+          <w:p>
+            <w:pPr>
+              <w:spacing w:after="0" w:line="250"/>
+            </w:pPr>
+            <w:r>
+              <w:rPr>
+                <w:rFonts w:ascii="Poppins" w:cs="Poppins" w:eastAsia="Poppins" w:hAnsi="Poppins"/>
+                <w:color w:val="1A1A1A"/>
+                <w:sz w:val="19"/>
+                <w:szCs w:val="19"/>
+              </w:rPr>
+              <w:t xml:space="preserve">The code made under the Online Safety Act setting out how services protect children from harmful content. Section 9.</w:t>
+            </w:r>
+          </w:p>
+        </w:tc>
+      </w:tr>
+      <w:tr>
+        <w:tc>
+          <w:tcPr>
+            <w:tcW w:type="dxa" w:w="3100"/>
+            <w:tcMar>
+              <w:top w:type="dxa" w:w="85"/>
+              <w:left w:type="dxa" w:w="125"/>
+              <w:bottom w:type="dxa" w:w="85"/>
+              <w:right w:type="dxa" w:w="125"/>
+            </w:tcMar>
+          </w:tcPr>
+          <w:p>
+            <w:pPr>
+              <w:spacing w:after="0" w:line="250"/>
+            </w:pPr>
+            <w:r>
+              <w:rPr>
+                <w:rFonts w:ascii="Poppins" w:cs="Poppins" w:eastAsia="Poppins" w:hAnsi="Poppins"/>
+                <w:b/>
+                <w:bCs/>
+                <w:color w:val="1A1A1A"/>
+                <w:sz w:val="19"/>
+                <w:szCs w:val="19"/>
+              </w:rPr>
+              <w:t xml:space="preserve">UK Safer Internet Centre: appropriate filtering and monitoring definitions</w:t>
+            </w:r>
+          </w:p>
+        </w:tc>
+        <w:tc>
+          <w:tcPr>
+            <w:tcW w:type="dxa" w:w="6420"/>
+            <w:tcMar>
+              <w:top w:type="dxa" w:w="85"/>
+              <w:left w:type="dxa" w:w="125"/>
+              <w:bottom w:type="dxa" w:w="85"/>
+              <w:right w:type="dxa" w:w="125"/>
+            </w:tcMar>
+          </w:tcPr>
+          <w:p>
+            <w:pPr>
+              <w:spacing w:after="0" w:line="250"/>
+            </w:pPr>
+            <w:r>
+              <w:rPr>
+                <w:rFonts w:ascii="Poppins" w:cs="Poppins" w:eastAsia="Poppins" w:hAnsi="Poppins"/>
+                <w:color w:val="1A1A1A"/>
+                <w:sz w:val="19"/>
+                <w:szCs w:val="19"/>
+              </w:rPr>
+              <w:t xml:space="preserve">The definitions the annual filtering and monitoring review is checked against. Section 12.</w:t>
+            </w:r>
+          </w:p>
+        </w:tc>
+      </w:tr>
+      <w:tr>
+        <w:tc>
+          <w:tcPr>
+            <w:tcW w:type="dxa" w:w="3100"/>
+            <w:tcMar>
+              <w:top w:type="dxa" w:w="85"/>
+              <w:left w:type="dxa" w:w="125"/>
+              <w:bottom w:type="dxa" w:w="85"/>
+              <w:right w:type="dxa" w:w="125"/>
+            </w:tcMar>
+          </w:tcPr>
+          <w:p>
+            <w:pPr>
+              <w:spacing w:after="0" w:line="250"/>
+            </w:pPr>
+            <w:r>
+              <w:rPr>
+                <w:rFonts w:ascii="Poppins" w:cs="Poppins" w:eastAsia="Poppins" w:hAnsi="Poppins"/>
+                <w:b/>
+                <w:bCs/>
+                <w:color w:val="1A1A1A"/>
+                <w:sz w:val="19"/>
+                <w:szCs w:val="19"/>
+              </w:rPr>
+              <w:t xml:space="preserve">Ofsted: AI in inspection and regulation</w:t>
+            </w:r>
+          </w:p>
+        </w:tc>
+        <w:tc>
+          <w:tcPr>
+            <w:tcW w:type="dxa" w:w="6420"/>
+            <w:tcMar>
+              <w:top w:type="dxa" w:w="85"/>
+              <w:left w:type="dxa" w:w="125"/>
+              <w:bottom w:type="dxa" w:w="85"/>
+              <w:right w:type="dxa" w:w="125"/>
+            </w:tcMar>
+          </w:tcPr>
+          <w:p>
+            <w:pPr>
+              <w:spacing w:after="0" w:line="250"/>
+            </w:pPr>
+            <w:r>
+              <w:rPr>
+                <w:rFonts w:ascii="Poppins" w:cs="Poppins" w:eastAsia="Poppins" w:hAnsi="Poppins"/>
+                <w:color w:val="1A1A1A"/>
+                <w:sz w:val="19"/>
+                <w:szCs w:val="19"/>
+              </w:rPr>
+              <w:t xml:space="preserve">Ofsted’s published position: it evaluates the organisation’s decision-making about AI, not the tools themselves. Section 12.</w:t>
+            </w:r>
+          </w:p>
+        </w:tc>
+      </w:tr>
+      <w:tr>
+        <w:tc>
+          <w:tcPr>
+            <w:tcW w:type="dxa" w:w="3100"/>
+            <w:tcMar>
+              <w:top w:type="dxa" w:w="85"/>
+              <w:left w:type="dxa" w:w="125"/>
+              <w:bottom w:type="dxa" w:w="85"/>
+              <w:right w:type="dxa" w:w="125"/>
+            </w:tcMar>
+          </w:tcPr>
+          <w:p>
+            <w:pPr>
+              <w:spacing w:after="0" w:line="250"/>
+            </w:pPr>
+            <w:r>
+              <w:rPr>
+                <w:rFonts w:ascii="Poppins" w:cs="Poppins" w:eastAsia="Poppins" w:hAnsi="Poppins"/>
+                <w:b/>
+                <w:bCs/>
+                <w:color w:val="1A1A1A"/>
+                <w:sz w:val="19"/>
+                <w:szCs w:val="19"/>
+              </w:rPr>
+              <w:t xml:space="preserve">Financial governance framework</w:t>
+            </w:r>
+          </w:p>
+        </w:tc>
+        <w:tc>
+          <w:tcPr>
+            <w:tcW w:type="dxa" w:w="6420"/>
+            <w:tcMar>
+              <w:top w:type="dxa" w:w="85"/>
+              <w:left w:type="dxa" w:w="125"/>
+              <w:bottom w:type="dxa" w:w="85"/>
+              <w:right w:type="dxa" w:w="125"/>
+            </w:tcMar>
+          </w:tcPr>
+          <w:p>
+            <w:pPr>
+              <w:spacing w:after="0" w:line="250"/>
+            </w:pPr>
+            <w:r>
+              <w:rPr>
+                <w:rFonts w:ascii="Poppins" w:cs="Poppins" w:eastAsia="Poppins" w:hAnsi="Poppins"/>
+                <w:color w:val="1A1A1A"/>
+                <w:sz w:val="19"/>
+                <w:szCs w:val="19"/>
+              </w:rPr>
+              <w:t xml:space="preserve">The Academy Trust Handbook for academy trusts (the 2026 edition takes effect from 1 October 2026); the local authority’s scheme for financing schools and the Schools Financial Value Standard for maintained schools. Section 1.</w:t>
+            </w:r>
+          </w:p>
+        </w:tc>
+      </w:tr>
+    </w:tbl>
     <w:tbl>
       <w:tblPr>
         <w:tblW w:type="dxa" w:w="9520"/>
@@ -6987,6 +8957,94 @@
                 <w:sz w:val="20"/>
                 <w:szCs w:val="20"/>
               </w:rPr>
+              <w:t xml:space="preserve">HOW TO COMPLETE THIS SECTION</w:t>
+            </w:r>
+          </w:p>
+          <w:p>
+            <w:pPr>
+              <w:spacing w:after="40" w:line="260"/>
+            </w:pPr>
+            <w:r>
+              <w:rPr>
+                <w:rFonts w:ascii="Poppins" w:cs="Poppins" w:eastAsia="Poppins" w:hAnsi="Poppins"/>
+                <w:color w:val="1A1A1A"/>
+                <w:sz w:val="19"/>
+                <w:szCs w:val="19"/>
+              </w:rPr>
+              <w:t xml:space="preserve">Check every instrument at adoption: confirm each is the current edition, remove any that do not apply to your setting, such as the trust or maintained-school financial framework, and add anything local.</w:t>
+            </w:r>
+          </w:p>
+          <w:p>
+            <w:pPr>
+              <w:spacing w:after="40" w:line="260"/>
+            </w:pPr>
+            <w:r>
+              <w:rPr>
+                <w:rFonts w:ascii="Poppins" w:cs="Poppins" w:eastAsia="Poppins" w:hAnsi="Poppins"/>
+                <w:color w:val="1A1A1A"/>
+                <w:sz w:val="19"/>
+                <w:szCs w:val="19"/>
+              </w:rPr>
+              <w:t xml:space="preserve">Commencement of the Crime and Policing Act 2026 is staged; confirm the provisions relied on are in force. If the expected Online Safety Act amendments on AI chatbots have passed by the time you adopt, add them here and review section 9.</w:t>
+            </w:r>
+          </w:p>
+          <w:p>
+            <w:pPr>
+              <w:spacing w:after="40" w:line="260"/>
+            </w:pPr>
+            <w:r>
+              <w:rPr>
+                <w:rFonts w:ascii="Poppins" w:cs="Poppins" w:eastAsia="Poppins" w:hAnsi="Poppins"/>
+                <w:color w:val="1A1A1A"/>
+                <w:sz w:val="19"/>
+                <w:szCs w:val="19"/>
+              </w:rPr>
+              <w:t xml:space="preserve">Unlike the guidance boxes, this appendix stays in the published policy; delete only this box.</w:t>
+            </w:r>
+          </w:p>
+        </w:tc>
+      </w:tr>
+    </w:tbl>
+    <w:tbl>
+      <w:tblPr>
+        <w:tblW w:type="dxa" w:w="9520"/>
+        <w:tblBorders>
+          <w:top w:val="single" w:color="BDC3C7" w:sz="4"/>
+          <w:left w:val="single" w:color="BDC3C7" w:sz="4"/>
+          <w:bottom w:val="single" w:color="BDC3C7" w:sz="4"/>
+          <w:right w:val="single" w:color="BDC3C7" w:sz="4"/>
+          <w:insideH w:val="none"/>
+          <w:insideV w:val="none"/>
+        </w:tblBorders>
+      </w:tblPr>
+      <w:tblGrid>
+        <w:gridCol w:w="9520"/>
+      </w:tblGrid>
+      <w:tr>
+        <w:tc>
+          <w:tcPr>
+            <w:tcW w:type="dxa" w:w="9520"/>
+            <w:shd w:fill="ECF0F1" w:val="clear"/>
+            <w:tcMar>
+              <w:top w:type="dxa" w:w="130"/>
+              <w:left w:type="dxa" w:w="190"/>
+              <w:bottom w:type="dxa" w:w="90"/>
+              <w:right w:type="dxa" w:w="190"/>
+            </w:tcMar>
+          </w:tcPr>
+          <w:p>
+            <w:pPr>
+              <w:spacing w:after="80"/>
+            </w:pPr>
+            <w:r>
+              <w:rPr>
+                <w:rFonts w:ascii="Exo 2" w:cs="Exo 2" w:eastAsia="Exo 2" w:hAnsi="Exo 2"/>
+                <w:b/>
+                <w:bCs/>
+                <w:color w:val="2C3E50"/>
+                <w:sz w:val="20"/>
+                <w:szCs w:val="20"/>
+              </w:rPr>
               <w:t xml:space="preserve">DISCLAIMER</w:t>
             </w:r>
           </w:p>
@@ -7025,7 +9083,7 @@
       <w:headerReference w:type="default" r:id="rId7"/>
       <w:footerReference w:type="default" r:id="rId8"/>
       <w:pgSz w:w="11906" w:h="16838" w:orient="portrait"/>
-      <w:pgMar w:top="1250" w:right="1150" w:bottom="1250" w:left="1150" w:header="708" w:footer="708" w:gutter="0"/>
+      <w:pgMar w:top="1100" w:right="1150" w:bottom="1100" w:left="1150" w:header="708" w:footer="708" w:gutter="0"/>
       <w:pgNumType/>
       <w:docGrid w:linePitch="360"/>
     </w:sectPr>

</xml_diff>